<commit_message>
pipeline progress ui and timer
</commit_message>
<xml_diff>
--- a/pipeline/Instructions.docx
+++ b/pipeline/Instructions.docx
@@ -9,8 +9,8 @@
           <w:ilvl w:val="0"/>
           <w:numId w:val="0"/>
         </w:numPr>
-        <w:suppressAutoHyphens w:val="true"/>
         <w:spacing w:before="240" w:after="120"/>
+        <w:ind w:hanging="0" w:start="0"/>
         <w:rPr/>
       </w:pPr>
       <w:r>
@@ -107,7 +107,7 @@
       </w:r>
       <w:r>
         <w:rPr/>
-        <w:t>Download Image Metadata Extraction Tool</w:t>
+        <w:t>How to Download  the mandatory Image Metadata Extraction Tool</w:t>
       </w:r>
     </w:p>
     <w:p>
@@ -117,13 +117,13 @@
           <w:ilvl w:val="0"/>
           <w:numId w:val="0"/>
         </w:numPr>
-        <w:suppressAutoHyphens w:val="true"/>
+        <w:ind w:hanging="0" w:start="0"/>
         <w:outlineLvl w:val="0"/>
         <w:rPr/>
       </w:pPr>
       <w:r>
         <w:rPr/>
-        <w:t>Click on “Image Metadata Management”</w:t>
+        <w:t>Click on “Image Metadata Management” on the panel to the left of the screen.</w:t>
       </w:r>
     </w:p>
     <w:p>
@@ -133,7 +133,7 @@
           <w:ilvl w:val="0"/>
           <w:numId w:val="0"/>
         </w:numPr>
-        <w:suppressAutoHyphens w:val="true"/>
+        <w:ind w:hanging="0" w:start="0"/>
         <w:outlineLvl w:val="0"/>
         <w:rPr/>
       </w:pPr>
@@ -148,7 +148,7 @@
           <w:ilvl w:val="0"/>
           <w:numId w:val="0"/>
         </w:numPr>
-        <w:suppressAutoHyphens w:val="true"/>
+        <w:ind w:hanging="0" w:start="0"/>
         <w:outlineLvl w:val="0"/>
         <w:rPr/>
       </w:pPr>
@@ -163,7 +163,7 @@
           <w:ilvl w:val="0"/>
           <w:numId w:val="0"/>
         </w:numPr>
-        <w:suppressAutoHyphens w:val="true"/>
+        <w:ind w:hanging="0" w:start="0"/>
         <w:outlineLvl w:val="0"/>
         <w:rPr/>
       </w:pPr>
@@ -178,7 +178,7 @@
           <w:ilvl w:val="0"/>
           <w:numId w:val="0"/>
         </w:numPr>
-        <w:suppressAutoHyphens w:val="true"/>
+        <w:ind w:hanging="0" w:start="0"/>
         <w:outlineLvl w:val="0"/>
         <w:rPr/>
       </w:pPr>
@@ -193,7 +193,7 @@
           <w:ilvl w:val="0"/>
           <w:numId w:val="0"/>
         </w:numPr>
-        <w:suppressAutoHyphens w:val="true"/>
+        <w:ind w:hanging="0" w:start="0"/>
         <w:outlineLvl w:val="0"/>
         <w:rPr/>
       </w:pPr>
@@ -208,7 +208,7 @@
           <w:ilvl w:val="0"/>
           <w:numId w:val="0"/>
         </w:numPr>
-        <w:suppressAutoHyphens w:val="true"/>
+        <w:ind w:hanging="0" w:start="0"/>
         <w:outlineLvl w:val="0"/>
         <w:rPr/>
       </w:pPr>
@@ -223,7 +223,7 @@
           <w:ilvl w:val="0"/>
           <w:numId w:val="0"/>
         </w:numPr>
-        <w:suppressAutoHyphens w:val="true"/>
+        <w:ind w:hanging="0" w:start="0"/>
         <w:outlineLvl w:val="0"/>
         <w:rPr/>
       </w:pPr>
@@ -238,7 +238,7 @@
           <w:ilvl w:val="0"/>
           <w:numId w:val="0"/>
         </w:numPr>
-        <w:suppressAutoHyphens w:val="true"/>
+        <w:ind w:hanging="0" w:start="0"/>
         <w:outlineLvl w:val="0"/>
         <w:rPr/>
       </w:pPr>
@@ -253,13 +253,13 @@
           <w:ilvl w:val="0"/>
           <w:numId w:val="0"/>
         </w:numPr>
-        <w:suppressAutoHyphens w:val="true"/>
+        <w:ind w:hanging="0" w:start="0"/>
         <w:outlineLvl w:val="0"/>
         <w:rPr/>
       </w:pPr>
       <w:r>
         <w:rPr/>
-        <w:t>Now click on “Download Extraction Tool”</w:t>
+        <w:t>Click on the  “Download Extraction Tool” button</w:t>
       </w:r>
       <w:r>
         <w:br w:type="page"/>
@@ -268,6 +268,7 @@
     <w:p>
       <w:pPr>
         <w:pStyle w:val="BodyText"/>
+        <w:spacing w:before="0" w:after="140"/>
         <w:rPr/>
       </w:pPr>
       <w:r>
@@ -277,26 +278,32 @@
     <w:p>
       <w:pPr>
         <w:pStyle w:val="Heading1"/>
+        <w:numPr>
+          <w:ilvl w:val="0"/>
+          <w:numId w:val="1"/>
+        </w:numPr>
         <w:tabs>
           <w:tab w:val="clear" w:pos="709"/>
           <w:tab w:val="left" w:pos="0" w:leader="none"/>
         </w:tabs>
-        <w:ind w:hanging="0" w:start="0"/>
-        <w:rPr/>
-      </w:pPr>
-      <w:r>
-        <w:rPr/>
-        <w:t>How to get python from the windows store</w:t>
+        <w:rPr/>
+      </w:pPr>
+      <w:r>
+        <w:rPr/>
+        <w:t>How to get python from the windows store (Required for Metadata Extraction Tool)</w:t>
       </w:r>
     </w:p>
     <w:p>
       <w:pPr>
         <w:pStyle w:val="Heading3"/>
+        <w:numPr>
+          <w:ilvl w:val="2"/>
+          <w:numId w:val="1"/>
+        </w:numPr>
         <w:tabs>
           <w:tab w:val="clear" w:pos="709"/>
           <w:tab w:val="left" w:pos="0" w:leader="none"/>
         </w:tabs>
-        <w:ind w:hanging="0" w:start="0"/>
         <w:rPr/>
       </w:pPr>
       <w:r>
@@ -357,9 +364,6 @@
     <w:p>
       <w:pPr>
         <w:pStyle w:val="BodyText"/>
-        <w:tabs>
-          <w:tab w:val="clear" w:pos="709"/>
-        </w:tabs>
         <w:spacing w:before="0" w:after="0"/>
         <w:ind w:start="709"/>
         <w:rPr/>
@@ -408,11 +412,14 @@
     <w:p>
       <w:pPr>
         <w:pStyle w:val="Heading3"/>
+        <w:numPr>
+          <w:ilvl w:val="2"/>
+          <w:numId w:val="1"/>
+        </w:numPr>
         <w:tabs>
           <w:tab w:val="clear" w:pos="709"/>
           <w:tab w:val="left" w:pos="0" w:leader="none"/>
         </w:tabs>
-        <w:ind w:hanging="0" w:start="0"/>
         <w:rPr/>
       </w:pPr>
       <w:r>
@@ -531,11 +538,14 @@
     <w:p>
       <w:pPr>
         <w:pStyle w:val="Heading3"/>
+        <w:numPr>
+          <w:ilvl w:val="2"/>
+          <w:numId w:val="1"/>
+        </w:numPr>
         <w:tabs>
           <w:tab w:val="clear" w:pos="709"/>
           <w:tab w:val="left" w:pos="0" w:leader="none"/>
         </w:tabs>
-        <w:ind w:hanging="0" w:start="0"/>
         <w:rPr/>
       </w:pPr>
       <w:r>
@@ -606,11 +616,14 @@
     <w:p>
       <w:pPr>
         <w:pStyle w:val="Heading3"/>
+        <w:numPr>
+          <w:ilvl w:val="2"/>
+          <w:numId w:val="1"/>
+        </w:numPr>
         <w:tabs>
           <w:tab w:val="clear" w:pos="709"/>
           <w:tab w:val="left" w:pos="0" w:leader="none"/>
         </w:tabs>
-        <w:ind w:hanging="0" w:start="0"/>
         <w:rPr/>
       </w:pPr>
       <w:r>
@@ -804,6 +817,123 @@
     <w:p>
       <w:pPr>
         <w:pStyle w:val="Normal"/>
+        <w:rPr>
+          <w:sz w:val="24"/>
+          <w:szCs w:val="24"/>
+        </w:rPr>
+      </w:pPr>
+      <w:r>
+        <w:rPr>
+          <w:sz w:val="24"/>
+          <w:szCs w:val="24"/>
+        </w:rPr>
+        <w:t xml:space="preserve">Extract the zip file </w:t>
+      </w:r>
+      <w:r>
+        <w:rPr>
+          <w:sz w:val="24"/>
+          <w:szCs w:val="24"/>
+        </w:rPr>
+        <w:t>using the following steps:</w:t>
+      </w:r>
+    </w:p>
+    <w:p>
+      <w:pPr>
+        <w:pStyle w:val="BodyText"/>
+        <w:numPr>
+          <w:ilvl w:val="0"/>
+          <w:numId w:val="5"/>
+        </w:numPr>
+        <w:tabs>
+          <w:tab w:val="clear" w:pos="709"/>
+          <w:tab w:val="left" w:pos="0" w:leader="none"/>
+        </w:tabs>
+        <w:ind w:hanging="360" w:start="720"/>
+        <w:rPr/>
+      </w:pPr>
+      <w:r>
+        <w:rPr/>
+        <w:t xml:space="preserve">Locate the </w:t>
+      </w:r>
+      <w:r>
+        <w:rPr/>
+        <w:t>folder</w:t>
+      </w:r>
+      <w:del w:id="0" w:author="Unknown Author" w:date="2026-03-06T14:40:17Z">
+        <w:r>
+          <w:rPr/>
+          <w:delText xml:space="preserve"> that you want</w:delText>
+        </w:r>
+      </w:del>
+      <w:r>
+        <w:rPr/>
+        <w:t xml:space="preserve"> </w:t>
+      </w:r>
+      <w:r>
+        <w:rPr/>
+        <w:t>containing the extraction tool,</w:t>
+      </w:r>
+      <w:r>
+        <w:rPr/>
+        <w:t xml:space="preserve"> to unzip (extract) files or folders from.</w:t>
+      </w:r>
+    </w:p>
+    <w:p>
+      <w:pPr>
+        <w:pStyle w:val="BodyText"/>
+        <w:numPr>
+          <w:ilvl w:val="0"/>
+          <w:numId w:val="5"/>
+        </w:numPr>
+        <w:tabs>
+          <w:tab w:val="clear" w:pos="709"/>
+          <w:tab w:val="left" w:pos="0" w:leader="none"/>
+        </w:tabs>
+        <w:ind w:hanging="360" w:start="720" w:end="0"/>
+        <w:rPr/>
+      </w:pPr>
+      <w:r>
+        <w:rPr/>
+        <w:t xml:space="preserve">To unzip all the contents of the zipped folder, press and hold (or right-click) the folder, select </w:t>
+      </w:r>
+      <w:r>
+        <w:rPr>
+          <w:b/>
+        </w:rPr>
+        <w:t>Extract All...</w:t>
+      </w:r>
+      <w:r>
+        <w:rPr/>
+        <w:t>, and then follow the instructions.</w:t>
+      </w:r>
+    </w:p>
+    <w:p>
+      <w:pPr>
+        <w:pStyle w:val="Normal"/>
+        <w:rPr>
+          <w:sz w:val="28"/>
+          <w:szCs w:val="32"/>
+        </w:rPr>
+      </w:pPr>
+      <w:r>
+        <w:rPr/>
+      </w:r>
+      <w:r>
+        <w:br w:type="page"/>
+      </w:r>
+    </w:p>
+    <w:p>
+      <w:pPr>
+        <w:pStyle w:val="Normal"/>
+        <w:rPr/>
+      </w:pPr>
+      <w:r>
+        <w:rPr/>
+      </w:r>
+    </w:p>
+    <w:p>
+      <w:pPr>
+        <w:pStyle w:val="Normal"/>
         <w:rPr/>
       </w:pPr>
       <w:r>
@@ -952,40 +1082,6 @@
         </w:rPr>
       </w:pPr>
       <w:r>
-        <w:rPr>
-          <w:b/>
-          <w:bCs/>
-          <w:sz w:val="28"/>
-          <w:szCs w:val="32"/>
-        </w:rPr>
-      </w:r>
-    </w:p>
-    <w:p>
-      <w:pPr>
-        <w:pStyle w:val="Normal"/>
-        <w:rPr>
-          <w:b w:val="false"/>
-          <w:bCs w:val="false"/>
-          <w:sz w:val="28"/>
-          <w:szCs w:val="32"/>
-        </w:rPr>
-      </w:pPr>
-      <w:r>
-        <w:rPr>
-          <w:b w:val="false"/>
-          <w:bCs w:val="false"/>
-          <w:sz w:val="28"/>
-          <w:szCs w:val="32"/>
-        </w:rPr>
-        <w:t>Extract the zip file</w:t>
-      </w:r>
-    </w:p>
-    <w:p>
-      <w:pPr>
-        <w:pStyle w:val="Normal"/>
-        <w:rPr/>
-      </w:pPr>
-      <w:r>
         <w:rPr/>
       </w:r>
     </w:p>
@@ -1130,6 +1226,7 @@
     <w:p>
       <w:pPr>
         <w:pStyle w:val="Normal"/>
+        <w:spacing w:before="0" w:after="0"/>
         <w:rPr/>
       </w:pPr>
       <w:r>
@@ -1218,16 +1315,7 @@
       </w:pPr>
       <w:r>
         <w:rPr/>
-        <w:t>Make sure that the directory is selected.</w:t>
-      </w:r>
-    </w:p>
-    <w:p>
-      <w:pPr>
-        <w:pStyle w:val="Normal"/>
-        <w:rPr/>
-      </w:pPr>
-      <w:r>
-        <w:rPr/>
+        <w:t>Make sure that the directory that the image files are in are selected.</w:t>
       </w:r>
     </w:p>
     <w:p>
@@ -1307,7 +1395,7 @@
         <w:rPr/>
         <w:drawing>
           <wp:inline distT="0" distB="0" distL="0" distR="0">
-            <wp:extent cx="5553710" cy="2133600"/>
+            <wp:extent cx="6443345" cy="2475230"/>
             <wp:effectExtent l="0" t="0" r="0" b="0"/>
             <wp:docPr id="12" name="Picture 9" descr="" title=""/>
             <wp:cNvGraphicFramePr>
@@ -1331,7 +1419,7 @@
                   <pic:spPr bwMode="auto">
                     <a:xfrm>
                       <a:off x="0" y="0"/>
-                      <a:ext cx="5553710" cy="2133600"/>
+                      <a:ext cx="6443345" cy="2475230"/>
                     </a:xfrm>
                     <a:prstGeom prst="rect">
                       <a:avLst/>
@@ -1394,6 +1482,60 @@
         </w:rPr>
         <w:t>Remember to upload the metadata csv file into the system immediately so that project and photographer will be tracked.</w:t>
       </w:r>
+      <w:r>
+        <w:rPr>
+          <w:rFonts w:ascii="Liberation Serif" w:hAnsi="Liberation Serif" w:eastAsia="Noto Serif CJK SC" w:cs="Noto Sans Devanagari"/>
+          <w:b w:val="false"/>
+          <w:bCs w:val="false"/>
+          <w:i w:val="false"/>
+          <w:iCs w:val="false"/>
+          <w:color w:val="auto"/>
+          <w:color w:val="EE0000"/>
+          <w:lang w:val="en-US" w:eastAsia="zh-CN" w:bidi="hi-IN"/>
+          <w:rPrChange w:id="0" w:author="Unknown Author" w:date="2026-03-06T14:23:03Z">
+            <w:rPr>
+              <w:sz w:val="24"/>
+              <w:i/>
+              <w:b/>
+              <w:kern w:val="2"/>
+              <w:szCs w:val="24"/>
+              <w:iCs/>
+              <w:bCs/>
+            </w:rPr>
+          </w:rPrChange>
+        </w:rPr>
+        <w:t xml:space="preserve"> </w:t>
+      </w:r>
+      <w:r>
+        <w:rPr>
+          <w:b w:val="false"/>
+          <w:bCs w:val="false"/>
+          <w:i w:val="false"/>
+          <w:iCs w:val="false"/>
+          <w:color w:val="auto"/>
+        </w:rPr>
+        <w:t>You may fil</w:t>
+      </w:r>
+      <w:r>
+        <w:rPr>
+          <w:b w:val="false"/>
+          <w:bCs w:val="false"/>
+          <w:i w:val="false"/>
+          <w:iCs w:val="false"/>
+          <w:color w:val="auto"/>
+        </w:rPr>
+        <w:t xml:space="preserve">l in any additional information manually (e.g. imaging platform). </w:t>
+      </w:r>
+      <w:r>
+        <w:rPr>
+          <w:b w:val="false"/>
+          <w:bCs w:val="false"/>
+          <w:i w:val="false"/>
+          <w:iCs w:val="false"/>
+          <w:color w:val="auto"/>
+        </w:rPr>
+        <w:t>You can also manually fill in the project and photographer IDs if you wish to have a different IDs for different rows. The IDs can be found in the Project Management Pages of the system via “View” button which will show the details of the project.</w:t>
+      </w:r>
     </w:p>
     <w:p>
       <w:pPr>
@@ -1442,7 +1584,25 @@
           <w:i/>
           <w:iCs/>
         </w:rPr>
-        <w:t>If you faced errors, you can compare the error log and the csv file side by side like this where the row indices correspond to the indices of the other file:</w:t>
+        <w:t xml:space="preserve">If you faced errors, you can compare the error log </w:t>
+      </w:r>
+      <w:r>
+        <w:rPr>
+          <w:b/>
+          <w:bCs/>
+          <w:i/>
+          <w:iCs/>
+        </w:rPr>
+        <w:t>(In the same unzipped folder as the extraction tool)</w:t>
+      </w:r>
+      <w:r>
+        <w:rPr>
+          <w:b/>
+          <w:bCs/>
+          <w:i/>
+          <w:iCs/>
+        </w:rPr>
+        <w:t xml:space="preserve"> and the csv file side by side like this where the row indices correspond to the indices of the other file:</w:t>
       </w:r>
     </w:p>
     <w:p>
@@ -1453,7 +1613,7 @@
       <w:r>
         <w:rPr/>
         <w:drawing>
-          <wp:anchor behindDoc="0" distT="0" distB="0" distL="0" distR="0" simplePos="0" locked="0" layoutInCell="0" allowOverlap="1" relativeHeight="11">
+          <wp:anchor behindDoc="0" distT="0" distB="0" distL="0" distR="0" simplePos="0" locked="0" layoutInCell="0" allowOverlap="1" relativeHeight="12">
             <wp:simplePos x="0" y="0"/>
             <wp:positionH relativeFrom="column">
               <wp:posOffset>-66675</wp:posOffset>
@@ -1505,6 +1665,7 @@
     <w:p>
       <w:pPr>
         <w:pStyle w:val="Normal"/>
+        <w:spacing w:before="0" w:after="0"/>
         <w:rPr/>
       </w:pPr>
       <w:r>
@@ -1613,11 +1774,14 @@
     <w:p>
       <w:pPr>
         <w:pStyle w:val="Heading1"/>
+        <w:numPr>
+          <w:ilvl w:val="0"/>
+          <w:numId w:val="1"/>
+        </w:numPr>
         <w:tabs>
           <w:tab w:val="clear" w:pos="709"/>
           <w:tab w:val="left" w:pos="0" w:leader="none"/>
         </w:tabs>
-        <w:ind w:hanging="0" w:start="0"/>
         <w:rPr/>
       </w:pPr>
       <w:r>
@@ -1632,16 +1796,17 @@
       </w:pPr>
       <w:r>
         <w:rPr/>
-      </w:r>
-    </w:p>
-    <w:p>
-      <w:pPr>
-        <w:pStyle w:val="Normal"/>
-        <w:rPr/>
-      </w:pPr>
-      <w:r>
-        <w:rPr/>
-        <w:t>Click on “Project Management” on the sidebar, then you will see the all available projects which you have none.</w:t>
+        <w:t>All images are registered as being generated or belonging to a project. You will need to create a project first to upload any image metadata.</w:t>
+      </w:r>
+    </w:p>
+    <w:p>
+      <w:pPr>
+        <w:pStyle w:val="Normal"/>
+        <w:rPr/>
+      </w:pPr>
+      <w:r>
+        <w:rPr/>
+        <w:t>To start, click on “Project Management” on the sidebar, then you will see the all available projects which you have none.</w:t>
       </w:r>
     </w:p>
     <w:p>
@@ -1778,15 +1943,7 @@
       </w:pPr>
       <w:r>
         <w:rPr/>
-        <w:t xml:space="preserve">click on “Add </w:t>
-      </w:r>
-      <w:r>
-        <w:rPr/>
-        <w:t>Project</w:t>
-      </w:r>
-      <w:r>
-        <w:rPr/>
-        <w:t>” from the right on the screen.</w:t>
+        <w:t>click on “Add Project” from the right on the screen.</w:t>
       </w:r>
     </w:p>
     <w:p>
@@ -1804,6 +1961,7 @@
     <w:p>
       <w:pPr>
         <w:pStyle w:val="Normal"/>
+        <w:spacing w:before="0" w:after="0"/>
         <w:rPr/>
       </w:pPr>
       <w:r>
@@ -1880,26 +2038,26 @@
       </w:pPr>
       <w:r>
         <w:rPr/>
-        <w:t>You will see a form to fill up in order to create a project. Fill up the form and press “Create Project”. You have no created A Project.</w:t>
-      </w:r>
-    </w:p>
-    <w:p>
-      <w:pPr>
-        <w:pStyle w:val="Normal"/>
-        <w:rPr/>
-      </w:pPr>
-      <w:r>
-        <w:rPr/>
-      </w:r>
-    </w:p>
-    <w:p>
-      <w:pPr>
-        <w:pStyle w:val="Normal"/>
-        <w:rPr/>
-      </w:pPr>
-      <w:r>
-        <w:rPr/>
-        <w:t>You could view details ,edit, delete projects.</w:t>
+        <w:t>You will see a form to fill up in order to create a project. Fill up the form and press “Create Project”. You have now created a Project.</w:t>
+      </w:r>
+    </w:p>
+    <w:p>
+      <w:pPr>
+        <w:pStyle w:val="Normal"/>
+        <w:rPr/>
+      </w:pPr>
+      <w:r>
+        <w:rPr/>
+      </w:r>
+    </w:p>
+    <w:p>
+      <w:pPr>
+        <w:pStyle w:val="Normal"/>
+        <w:rPr/>
+      </w:pPr>
+      <w:r>
+        <w:rPr/>
+        <w:t>You can view details ,edit, delete projects.</w:t>
       </w:r>
     </w:p>
     <w:p>
@@ -1917,6 +2075,7 @@
     <w:p>
       <w:pPr>
         <w:pStyle w:val="Normal"/>
+        <w:spacing w:before="0" w:after="0"/>
         <w:rPr/>
       </w:pPr>
       <w:r>
@@ -2016,32 +2175,19 @@
     <w:p>
       <w:pPr>
         <w:pStyle w:val="Heading1"/>
+        <w:numPr>
+          <w:ilvl w:val="0"/>
+          <w:numId w:val="1"/>
+        </w:numPr>
         <w:tabs>
           <w:tab w:val="clear" w:pos="709"/>
           <w:tab w:val="left" w:pos="0" w:leader="none"/>
         </w:tabs>
-        <w:ind w:hanging="0" w:start="0"/>
-        <w:rPr/>
-      </w:pPr>
-      <w:r>
-        <w:rPr/>
-        <w:t>Bu</w:t>
-      </w:r>
-      <w:r>
-        <w:rPr/>
-        <w:t>l</w:t>
-      </w:r>
-      <w:r>
-        <w:rPr/>
-        <w:t>k Met</w:t>
-      </w:r>
-      <w:r>
-        <w:rPr/>
-        <w:t>a</w:t>
-      </w:r>
-      <w:r>
-        <w:rPr/>
-        <w:t xml:space="preserve">data Upload </w:t>
+        <w:rPr/>
+      </w:pPr>
+      <w:r>
+        <w:rPr/>
+        <w:t xml:space="preserve">Bulk Metadata Upload </w:t>
       </w:r>
     </w:p>
     <w:p>
@@ -2191,11 +2337,7 @@
       </w:pPr>
       <w:r>
         <w:rPr/>
-        <w:t xml:space="preserve">Now, click on “Upload Bulk” </w:t>
-      </w:r>
-      <w:r>
-        <w:rPr/>
-        <w:t>from the left of the screen</w:t>
+        <w:t>Now, click on “Upload Bulk” from the left of the screen</w:t>
       </w:r>
     </w:p>
     <w:p>
@@ -2213,6 +2355,7 @@
     <w:p>
       <w:pPr>
         <w:pStyle w:val="Normal"/>
+        <w:spacing w:before="0" w:after="0"/>
         <w:rPr/>
       </w:pPr>
       <w:r>
@@ -2325,11 +2468,15 @@
     <w:p>
       <w:pPr>
         <w:pStyle w:val="Heading1"/>
+        <w:numPr>
+          <w:ilvl w:val="0"/>
+          <w:numId w:val="1"/>
+        </w:numPr>
         <w:tabs>
           <w:tab w:val="clear" w:pos="709"/>
           <w:tab w:val="left" w:pos="0" w:leader="none"/>
         </w:tabs>
-        <w:ind w:hanging="0" w:start="0"/>
+        <w:spacing w:before="0" w:after="120"/>
         <w:rPr/>
       </w:pPr>
       <w:r>
@@ -2353,7 +2500,6 @@
       </w:pPr>
       <w:r>
         <w:rPr>
-          <w:rStyle w:val="DefaultParagraphFont"/>
           <w:b/>
           <w:bCs/>
           <w:sz w:val="30"/>
@@ -2395,7 +2541,6 @@
     <w:p>
       <w:pPr>
         <w:pStyle w:val="BodyText"/>
-        <w:suppressAutoHyphens w:val="true"/>
         <w:spacing w:lineRule="auto" w:line="276" w:before="0" w:after="140"/>
         <w:rPr/>
       </w:pPr>
@@ -2422,7 +2567,6 @@
   <w:abstractNum w:abstractNumId="1">
     <w:lvl w:ilvl="0">
       <w:start w:val="1"/>
-      <w:pStyle w:val="Heading1"/>
       <w:numFmt w:val="none"/>
       <w:suff w:val="nothing"/>
       <w:lvlText w:val="%1"/>
@@ -2433,6 +2577,7 @@
         </w:tabs>
         <w:ind w:start="0" w:hanging="0"/>
       </w:pPr>
+      <w:rPr/>
     </w:lvl>
     <w:lvl w:ilvl="1">
       <w:start w:val="1"/>
@@ -2446,10 +2591,10 @@
         </w:tabs>
         <w:ind w:start="0" w:hanging="0"/>
       </w:pPr>
+      <w:rPr/>
     </w:lvl>
     <w:lvl w:ilvl="2">
       <w:start w:val="1"/>
-      <w:pStyle w:val="Heading3"/>
       <w:numFmt w:val="none"/>
       <w:suff w:val="nothing"/>
       <w:lvlText w:val="%3"/>
@@ -2460,6 +2605,7 @@
         </w:tabs>
         <w:ind w:start="0" w:hanging="0"/>
       </w:pPr>
+      <w:rPr/>
     </w:lvl>
     <w:lvl w:ilvl="3">
       <w:start w:val="1"/>
@@ -2473,6 +2619,7 @@
         </w:tabs>
         <w:ind w:start="0" w:hanging="0"/>
       </w:pPr>
+      <w:rPr/>
     </w:lvl>
     <w:lvl w:ilvl="4">
       <w:start w:val="1"/>
@@ -2486,6 +2633,7 @@
         </w:tabs>
         <w:ind w:start="0" w:hanging="0"/>
       </w:pPr>
+      <w:rPr/>
     </w:lvl>
     <w:lvl w:ilvl="5">
       <w:start w:val="1"/>
@@ -2499,6 +2647,7 @@
         </w:tabs>
         <w:ind w:start="0" w:hanging="0"/>
       </w:pPr>
+      <w:rPr/>
     </w:lvl>
     <w:lvl w:ilvl="6">
       <w:start w:val="1"/>
@@ -2512,6 +2661,7 @@
         </w:tabs>
         <w:ind w:start="0" w:hanging="0"/>
       </w:pPr>
+      <w:rPr/>
     </w:lvl>
     <w:lvl w:ilvl="7">
       <w:start w:val="1"/>
@@ -2525,6 +2675,7 @@
         </w:tabs>
         <w:ind w:start="0" w:hanging="0"/>
       </w:pPr>
+      <w:rPr/>
     </w:lvl>
     <w:lvl w:ilvl="8">
       <w:start w:val="1"/>
@@ -2538,6 +2689,7 @@
         </w:tabs>
         <w:ind w:start="0" w:hanging="0"/>
       </w:pPr>
+      <w:rPr/>
     </w:lvl>
   </w:abstractNum>
   <w:abstractNum w:abstractNumId="2">
@@ -2552,6 +2704,7 @@
         </w:tabs>
         <w:ind w:start="709" w:hanging="283"/>
       </w:pPr>
+      <w:rPr/>
     </w:lvl>
     <w:lvl w:ilvl="1">
       <w:start w:val="1"/>
@@ -2564,6 +2717,7 @@
         </w:tabs>
         <w:ind w:start="1418" w:hanging="283"/>
       </w:pPr>
+      <w:rPr/>
     </w:lvl>
     <w:lvl w:ilvl="2">
       <w:start w:val="1"/>
@@ -2576,6 +2730,7 @@
         </w:tabs>
         <w:ind w:start="2127" w:hanging="283"/>
       </w:pPr>
+      <w:rPr/>
     </w:lvl>
     <w:lvl w:ilvl="3">
       <w:start w:val="1"/>
@@ -2588,6 +2743,7 @@
         </w:tabs>
         <w:ind w:start="2836" w:hanging="283"/>
       </w:pPr>
+      <w:rPr/>
     </w:lvl>
     <w:lvl w:ilvl="4">
       <w:start w:val="1"/>
@@ -2600,6 +2756,7 @@
         </w:tabs>
         <w:ind w:start="3545" w:hanging="283"/>
       </w:pPr>
+      <w:rPr/>
     </w:lvl>
     <w:lvl w:ilvl="5">
       <w:start w:val="1"/>
@@ -2612,6 +2769,7 @@
         </w:tabs>
         <w:ind w:start="4254" w:hanging="283"/>
       </w:pPr>
+      <w:rPr/>
     </w:lvl>
     <w:lvl w:ilvl="6">
       <w:start w:val="1"/>
@@ -2624,6 +2782,7 @@
         </w:tabs>
         <w:ind w:start="4963" w:hanging="283"/>
       </w:pPr>
+      <w:rPr/>
     </w:lvl>
     <w:lvl w:ilvl="7">
       <w:start w:val="1"/>
@@ -2636,6 +2795,7 @@
         </w:tabs>
         <w:ind w:start="5672" w:hanging="283"/>
       </w:pPr>
+      <w:rPr/>
     </w:lvl>
     <w:lvl w:ilvl="8">
       <w:start w:val="1"/>
@@ -2648,6 +2808,7 @@
         </w:tabs>
         <w:ind w:start="6381" w:hanging="283"/>
       </w:pPr>
+      <w:rPr/>
     </w:lvl>
   </w:abstractNum>
   <w:abstractNum w:abstractNumId="3">
@@ -2922,6 +3083,260 @@
       <w:rPr>
         <w:rFonts w:ascii="OpenSymbol" w:hAnsi="OpenSymbol" w:cs="OpenSymbol" w:hint="default"/>
       </w:rPr>
+    </w:lvl>
+  </w:abstractNum>
+  <w:abstractNum w:abstractNumId="5">
+    <w:lvl w:ilvl="0">
+      <w:start w:val="1"/>
+      <w:numFmt w:val="decimal"/>
+      <w:lvlText w:val="%1."/>
+      <w:lvlJc w:val="start"/>
+      <w:pPr>
+        <w:tabs>
+          <w:tab w:val="num" w:pos="720"/>
+        </w:tabs>
+        <w:ind w:start="720" w:hanging="360"/>
+      </w:pPr>
+    </w:lvl>
+    <w:lvl w:ilvl="1">
+      <w:start w:val="1"/>
+      <w:numFmt w:val="bullet"/>
+      <w:lvlText w:val=""/>
+      <w:lvlJc w:val="start"/>
+      <w:pPr>
+        <w:tabs>
+          <w:tab w:val="num" w:pos="1429"/>
+        </w:tabs>
+        <w:ind w:start="1429" w:hanging="360"/>
+      </w:pPr>
+      <w:rPr>
+        <w:rFonts w:ascii="Symbol" w:hAnsi="Symbol" w:cs="Symbol" w:hint="default"/>
+      </w:rPr>
+    </w:lvl>
+    <w:lvl w:ilvl="2">
+      <w:start w:val="1"/>
+      <w:numFmt w:val="bullet"/>
+      <w:lvlText w:val=""/>
+      <w:lvlJc w:val="start"/>
+      <w:pPr>
+        <w:tabs>
+          <w:tab w:val="num" w:pos="2127"/>
+        </w:tabs>
+        <w:ind w:start="2127" w:hanging="283"/>
+      </w:pPr>
+      <w:rPr>
+        <w:rFonts w:ascii="Symbol" w:hAnsi="Symbol" w:cs="Symbol" w:hint="default"/>
+      </w:rPr>
+    </w:lvl>
+    <w:lvl w:ilvl="3">
+      <w:start w:val="1"/>
+      <w:numFmt w:val="bullet"/>
+      <w:lvlText w:val=""/>
+      <w:lvlJc w:val="start"/>
+      <w:pPr>
+        <w:tabs>
+          <w:tab w:val="num" w:pos="2836"/>
+        </w:tabs>
+        <w:ind w:start="2836" w:hanging="283"/>
+      </w:pPr>
+      <w:rPr>
+        <w:rFonts w:ascii="Symbol" w:hAnsi="Symbol" w:cs="Symbol" w:hint="default"/>
+      </w:rPr>
+    </w:lvl>
+    <w:lvl w:ilvl="4">
+      <w:start w:val="1"/>
+      <w:numFmt w:val="bullet"/>
+      <w:lvlText w:val=""/>
+      <w:lvlJc w:val="start"/>
+      <w:pPr>
+        <w:tabs>
+          <w:tab w:val="num" w:pos="3545"/>
+        </w:tabs>
+        <w:ind w:start="3545" w:hanging="283"/>
+      </w:pPr>
+      <w:rPr>
+        <w:rFonts w:ascii="Symbol" w:hAnsi="Symbol" w:cs="Symbol" w:hint="default"/>
+      </w:rPr>
+    </w:lvl>
+    <w:lvl w:ilvl="5">
+      <w:start w:val="1"/>
+      <w:numFmt w:val="bullet"/>
+      <w:lvlText w:val=""/>
+      <w:lvlJc w:val="start"/>
+      <w:pPr>
+        <w:tabs>
+          <w:tab w:val="num" w:pos="4254"/>
+        </w:tabs>
+        <w:ind w:start="4254" w:hanging="283"/>
+      </w:pPr>
+      <w:rPr>
+        <w:rFonts w:ascii="Symbol" w:hAnsi="Symbol" w:cs="Symbol" w:hint="default"/>
+      </w:rPr>
+    </w:lvl>
+    <w:lvl w:ilvl="6">
+      <w:start w:val="1"/>
+      <w:numFmt w:val="bullet"/>
+      <w:lvlText w:val=""/>
+      <w:lvlJc w:val="start"/>
+      <w:pPr>
+        <w:tabs>
+          <w:tab w:val="num" w:pos="4963"/>
+        </w:tabs>
+        <w:ind w:start="4963" w:hanging="283"/>
+      </w:pPr>
+      <w:rPr>
+        <w:rFonts w:ascii="Symbol" w:hAnsi="Symbol" w:cs="Symbol" w:hint="default"/>
+      </w:rPr>
+    </w:lvl>
+    <w:lvl w:ilvl="7">
+      <w:start w:val="1"/>
+      <w:numFmt w:val="bullet"/>
+      <w:lvlText w:val=""/>
+      <w:lvlJc w:val="start"/>
+      <w:pPr>
+        <w:tabs>
+          <w:tab w:val="num" w:pos="5672"/>
+        </w:tabs>
+        <w:ind w:start="5672" w:hanging="283"/>
+      </w:pPr>
+      <w:rPr>
+        <w:rFonts w:ascii="Symbol" w:hAnsi="Symbol" w:cs="Symbol" w:hint="default"/>
+      </w:rPr>
+    </w:lvl>
+    <w:lvl w:ilvl="8">
+      <w:start w:val="1"/>
+      <w:numFmt w:val="bullet"/>
+      <w:lvlText w:val=""/>
+      <w:lvlJc w:val="start"/>
+      <w:pPr>
+        <w:tabs>
+          <w:tab w:val="num" w:pos="6381"/>
+        </w:tabs>
+        <w:ind w:start="6381" w:hanging="283"/>
+      </w:pPr>
+      <w:rPr>
+        <w:rFonts w:ascii="Symbol" w:hAnsi="Symbol" w:cs="Symbol" w:hint="default"/>
+      </w:rPr>
+    </w:lvl>
+  </w:abstractNum>
+  <w:abstractNum w:abstractNumId="6">
+    <w:lvl w:ilvl="0">
+      <w:start w:val="1"/>
+      <w:numFmt w:val="none"/>
+      <w:suff w:val="nothing"/>
+      <w:lvlText w:val=""/>
+      <w:lvlJc w:val="start"/>
+      <w:pPr>
+        <w:tabs>
+          <w:tab w:val="num" w:pos="0"/>
+        </w:tabs>
+        <w:ind w:start="0" w:hanging="0"/>
+      </w:pPr>
+    </w:lvl>
+    <w:lvl w:ilvl="1">
+      <w:start w:val="1"/>
+      <w:pStyle w:val="Heading2"/>
+      <w:numFmt w:val="none"/>
+      <w:suff w:val="nothing"/>
+      <w:lvlText w:val=""/>
+      <w:lvlJc w:val="start"/>
+      <w:pPr>
+        <w:tabs>
+          <w:tab w:val="num" w:pos="0"/>
+        </w:tabs>
+        <w:ind w:start="0" w:hanging="0"/>
+      </w:pPr>
+    </w:lvl>
+    <w:lvl w:ilvl="2">
+      <w:start w:val="1"/>
+      <w:numFmt w:val="none"/>
+      <w:suff w:val="nothing"/>
+      <w:lvlText w:val=""/>
+      <w:lvlJc w:val="start"/>
+      <w:pPr>
+        <w:tabs>
+          <w:tab w:val="num" w:pos="0"/>
+        </w:tabs>
+        <w:ind w:start="0" w:hanging="0"/>
+      </w:pPr>
+    </w:lvl>
+    <w:lvl w:ilvl="3">
+      <w:start w:val="1"/>
+      <w:numFmt w:val="none"/>
+      <w:suff w:val="nothing"/>
+      <w:lvlText w:val=""/>
+      <w:lvlJc w:val="start"/>
+      <w:pPr>
+        <w:tabs>
+          <w:tab w:val="num" w:pos="0"/>
+        </w:tabs>
+        <w:ind w:start="0" w:hanging="0"/>
+      </w:pPr>
+    </w:lvl>
+    <w:lvl w:ilvl="4">
+      <w:start w:val="1"/>
+      <w:numFmt w:val="none"/>
+      <w:suff w:val="nothing"/>
+      <w:lvlText w:val=""/>
+      <w:lvlJc w:val="start"/>
+      <w:pPr>
+        <w:tabs>
+          <w:tab w:val="num" w:pos="0"/>
+        </w:tabs>
+        <w:ind w:start="0" w:hanging="0"/>
+      </w:pPr>
+    </w:lvl>
+    <w:lvl w:ilvl="5">
+      <w:start w:val="1"/>
+      <w:numFmt w:val="none"/>
+      <w:suff w:val="nothing"/>
+      <w:lvlText w:val=""/>
+      <w:lvlJc w:val="start"/>
+      <w:pPr>
+        <w:tabs>
+          <w:tab w:val="num" w:pos="0"/>
+        </w:tabs>
+        <w:ind w:start="0" w:hanging="0"/>
+      </w:pPr>
+    </w:lvl>
+    <w:lvl w:ilvl="6">
+      <w:start w:val="1"/>
+      <w:numFmt w:val="none"/>
+      <w:suff w:val="nothing"/>
+      <w:lvlText w:val=""/>
+      <w:lvlJc w:val="start"/>
+      <w:pPr>
+        <w:tabs>
+          <w:tab w:val="num" w:pos="0"/>
+        </w:tabs>
+        <w:ind w:start="0" w:hanging="0"/>
+      </w:pPr>
+    </w:lvl>
+    <w:lvl w:ilvl="7">
+      <w:start w:val="1"/>
+      <w:numFmt w:val="none"/>
+      <w:suff w:val="nothing"/>
+      <w:lvlText w:val=""/>
+      <w:lvlJc w:val="start"/>
+      <w:pPr>
+        <w:tabs>
+          <w:tab w:val="num" w:pos="0"/>
+        </w:tabs>
+        <w:ind w:start="0" w:hanging="0"/>
+      </w:pPr>
+    </w:lvl>
+    <w:lvl w:ilvl="8">
+      <w:start w:val="1"/>
+      <w:numFmt w:val="none"/>
+      <w:suff w:val="nothing"/>
+      <w:lvlText w:val=""/>
+      <w:lvlJc w:val="start"/>
+      <w:pPr>
+        <w:tabs>
+          <w:tab w:val="num" w:pos="0"/>
+        </w:tabs>
+        <w:ind w:start="0" w:hanging="0"/>
+      </w:pPr>
     </w:lvl>
   </w:abstractNum>
   <w:num w:numId="1">
@@ -2935,6 +3350,12 @@
   </w:num>
   <w:num w:numId="4">
     <w:abstractNumId w:val="4"/>
+  </w:num>
+  <w:num w:numId="5">
+    <w:abstractNumId w:val="5"/>
+  </w:num>
+  <w:num w:numId="6">
+    <w:abstractNumId w:val="6"/>
   </w:num>
 </w:numbering>
 </file>
@@ -2953,55 +3374,404 @@
     </w:rPrDefault>
     <w:pPrDefault>
       <w:pPr>
-        <w:widowControl/>
-        <w:suppressAutoHyphens w:val="false"/>
+        <w:suppressAutoHyphens w:val="true"/>
       </w:pPr>
     </w:pPrDefault>
   </w:docDefaults>
-  <w:style w:type="paragraph" w:styleId="Normal">
+  <w:latentStyles w:defLockedState="0" w:defUIPriority="99" w:defSemiHidden="0" w:defUnhideWhenUsed="0" w:defQFormat="0" w:count="376">
+    <w:lsdException w:name="Normal" w:uiPriority="0" w:qFormat="1"/>
+    <w:lsdException w:name="heading 1" w:uiPriority="9" w:qFormat="1"/>
+    <w:lsdException w:name="heading 2" w:uiPriority="9" w:semiHidden="1" w:unhideWhenUsed="1" w:qFormat="1"/>
+    <w:lsdException w:name="heading 3" w:uiPriority="9" w:semiHidden="1" w:unhideWhenUsed="1" w:qFormat="1"/>
+    <w:lsdException w:name="heading 4" w:uiPriority="9" w:semiHidden="1" w:unhideWhenUsed="1" w:qFormat="1"/>
+    <w:lsdException w:name="heading 5" w:uiPriority="9" w:semiHidden="1" w:unhideWhenUsed="1" w:qFormat="1"/>
+    <w:lsdException w:name="heading 6" w:uiPriority="9" w:semiHidden="1" w:unhideWhenUsed="1" w:qFormat="1"/>
+    <w:lsdException w:name="heading 7" w:uiPriority="9" w:semiHidden="1" w:unhideWhenUsed="1" w:qFormat="1"/>
+    <w:lsdException w:name="heading 8" w:uiPriority="9" w:semiHidden="1" w:unhideWhenUsed="1" w:qFormat="1"/>
+    <w:lsdException w:name="heading 9" w:uiPriority="9" w:semiHidden="1" w:unhideWhenUsed="1" w:qFormat="1"/>
+    <w:lsdException w:name="index 1" w:semiHidden="1" w:unhideWhenUsed="1"/>
+    <w:lsdException w:name="index 2" w:semiHidden="1" w:unhideWhenUsed="1"/>
+    <w:lsdException w:name="index 3" w:semiHidden="1" w:unhideWhenUsed="1"/>
+    <w:lsdException w:name="index 4" w:semiHidden="1" w:unhideWhenUsed="1"/>
+    <w:lsdException w:name="index 5" w:semiHidden="1" w:unhideWhenUsed="1"/>
+    <w:lsdException w:name="index 6" w:semiHidden="1" w:unhideWhenUsed="1"/>
+    <w:lsdException w:name="index 7" w:semiHidden="1" w:unhideWhenUsed="1"/>
+    <w:lsdException w:name="index 8" w:semiHidden="1" w:unhideWhenUsed="1"/>
+    <w:lsdException w:name="index 9" w:semiHidden="1" w:unhideWhenUsed="1"/>
+    <w:lsdException w:name="toc 1" w:uiPriority="39" w:semiHidden="1" w:unhideWhenUsed="1"/>
+    <w:lsdException w:name="toc 2" w:uiPriority="39" w:semiHidden="1" w:unhideWhenUsed="1"/>
+    <w:lsdException w:name="toc 3" w:uiPriority="39" w:semiHidden="1" w:unhideWhenUsed="1"/>
+    <w:lsdException w:name="toc 4" w:uiPriority="39" w:semiHidden="1" w:unhideWhenUsed="1"/>
+    <w:lsdException w:name="toc 5" w:uiPriority="39" w:semiHidden="1" w:unhideWhenUsed="1"/>
+    <w:lsdException w:name="toc 6" w:uiPriority="39" w:semiHidden="1" w:unhideWhenUsed="1"/>
+    <w:lsdException w:name="toc 7" w:uiPriority="39" w:semiHidden="1" w:unhideWhenUsed="1"/>
+    <w:lsdException w:name="toc 8" w:uiPriority="39" w:semiHidden="1" w:unhideWhenUsed="1"/>
+    <w:lsdException w:name="toc 9" w:uiPriority="39" w:semiHidden="1" w:unhideWhenUsed="1"/>
+    <w:lsdException w:name="Normal Indent" w:semiHidden="1" w:unhideWhenUsed="1"/>
+    <w:lsdException w:name="footnote text" w:semiHidden="1" w:unhideWhenUsed="1"/>
+    <w:lsdException w:name="annotation text" w:semiHidden="1" w:unhideWhenUsed="1"/>
+    <w:lsdException w:name="header" w:semiHidden="1" w:unhideWhenUsed="1"/>
+    <w:lsdException w:name="footer" w:semiHidden="1" w:unhideWhenUsed="1"/>
+    <w:lsdException w:name="index heading" w:semiHidden="1" w:unhideWhenUsed="1"/>
+    <w:lsdException w:name="caption" w:uiPriority="35" w:semiHidden="1" w:unhideWhenUsed="1" w:qFormat="1"/>
+    <w:lsdException w:name="table of figures" w:semiHidden="1" w:unhideWhenUsed="1"/>
+    <w:lsdException w:name="envelope address" w:semiHidden="1" w:unhideWhenUsed="1"/>
+    <w:lsdException w:name="envelope return" w:semiHidden="1" w:unhideWhenUsed="1"/>
+    <w:lsdException w:name="footnote reference" w:semiHidden="1" w:unhideWhenUsed="1"/>
+    <w:lsdException w:name="annotation reference" w:semiHidden="1" w:unhideWhenUsed="1"/>
+    <w:lsdException w:name="line number" w:semiHidden="1" w:unhideWhenUsed="1"/>
+    <w:lsdException w:name="page number" w:semiHidden="1" w:unhideWhenUsed="1"/>
+    <w:lsdException w:name="endnote reference" w:semiHidden="1" w:unhideWhenUsed="1"/>
+    <w:lsdException w:name="endnote text" w:semiHidden="1" w:unhideWhenUsed="1"/>
+    <w:lsdException w:name="table of authorities" w:semiHidden="1" w:unhideWhenUsed="1"/>
+    <w:lsdException w:name="macro" w:semiHidden="1" w:unhideWhenUsed="1"/>
+    <w:lsdException w:name="toa heading" w:semiHidden="1" w:unhideWhenUsed="1"/>
+    <w:lsdException w:name="List" w:semiHidden="1" w:unhideWhenUsed="1"/>
+    <w:lsdException w:name="List Bullet" w:semiHidden="1" w:unhideWhenUsed="1"/>
+    <w:lsdException w:name="List Number" w:semiHidden="1" w:unhideWhenUsed="1"/>
+    <w:lsdException w:name="List 2" w:semiHidden="1" w:unhideWhenUsed="1"/>
+    <w:lsdException w:name="List 3" w:semiHidden="1" w:unhideWhenUsed="1"/>
+    <w:lsdException w:name="List 4" w:semiHidden="1" w:unhideWhenUsed="1"/>
+    <w:lsdException w:name="List 5" w:semiHidden="1" w:unhideWhenUsed="1"/>
+    <w:lsdException w:name="List Bullet 2" w:semiHidden="1" w:unhideWhenUsed="1"/>
+    <w:lsdException w:name="List Bullet 3" w:semiHidden="1" w:unhideWhenUsed="1"/>
+    <w:lsdException w:name="List Bullet 4" w:semiHidden="1" w:unhideWhenUsed="1"/>
+    <w:lsdException w:name="List Bullet 5" w:semiHidden="1" w:unhideWhenUsed="1"/>
+    <w:lsdException w:name="List Number 2" w:semiHidden="1" w:unhideWhenUsed="1"/>
+    <w:lsdException w:name="List Number 3" w:semiHidden="1" w:unhideWhenUsed="1"/>
+    <w:lsdException w:name="List Number 4" w:semiHidden="1" w:unhideWhenUsed="1"/>
+    <w:lsdException w:name="List Number 5" w:semiHidden="1" w:unhideWhenUsed="1"/>
+    <w:lsdException w:name="Title" w:uiPriority="10" w:qFormat="1"/>
+    <w:lsdException w:name="Closing" w:semiHidden="1" w:unhideWhenUsed="1"/>
+    <w:lsdException w:name="Signature" w:semiHidden="1" w:unhideWhenUsed="1"/>
+    <w:lsdException w:name="Default Paragraph Font" w:uiPriority="1" w:semiHidden="1" w:unhideWhenUsed="1"/>
+    <w:lsdException w:name="Body Text" w:semiHidden="1" w:unhideWhenUsed="1"/>
+    <w:lsdException w:name="Body Text Indent" w:semiHidden="1" w:unhideWhenUsed="1"/>
+    <w:lsdException w:name="List Continue" w:semiHidden="1" w:unhideWhenUsed="1"/>
+    <w:lsdException w:name="List Continue 2" w:semiHidden="1" w:unhideWhenUsed="1"/>
+    <w:lsdException w:name="List Continue 3" w:semiHidden="1" w:unhideWhenUsed="1"/>
+    <w:lsdException w:name="List Continue 4" w:semiHidden="1" w:unhideWhenUsed="1"/>
+    <w:lsdException w:name="List Continue 5" w:semiHidden="1" w:unhideWhenUsed="1"/>
+    <w:lsdException w:name="Message Header" w:semiHidden="1" w:unhideWhenUsed="1"/>
+    <w:lsdException w:name="Subtitle" w:uiPriority="11" w:qFormat="1"/>
+    <w:lsdException w:name="Salutation" w:semiHidden="1" w:unhideWhenUsed="1"/>
+    <w:lsdException w:name="Date" w:semiHidden="1" w:unhideWhenUsed="1"/>
+    <w:lsdException w:name="Body Text First Indent" w:semiHidden="1" w:unhideWhenUsed="1"/>
+    <w:lsdException w:name="Body Text First Indent 2" w:semiHidden="1" w:unhideWhenUsed="1"/>
+    <w:lsdException w:name="Note Heading" w:semiHidden="1" w:unhideWhenUsed="1"/>
+    <w:lsdException w:name="Body Text 2" w:semiHidden="1" w:unhideWhenUsed="1"/>
+    <w:lsdException w:name="Body Text 3" w:semiHidden="1" w:unhideWhenUsed="1"/>
+    <w:lsdException w:name="Body Text Indent 2" w:semiHidden="1" w:unhideWhenUsed="1"/>
+    <w:lsdException w:name="Body Text Indent 3" w:semiHidden="1" w:unhideWhenUsed="1"/>
+    <w:lsdException w:name="Block Text" w:semiHidden="1" w:unhideWhenUsed="1"/>
+    <w:lsdException w:name="Hyperlink" w:semiHidden="1" w:unhideWhenUsed="1"/>
+    <w:lsdException w:name="FollowedHyperlink" w:semiHidden="1" w:unhideWhenUsed="1"/>
+    <w:lsdException w:name="Strong" w:uiPriority="22" w:qFormat="1"/>
+    <w:lsdException w:name="Emphasis" w:uiPriority="20" w:qFormat="1"/>
+    <w:lsdException w:name="Document Map" w:semiHidden="1" w:unhideWhenUsed="1"/>
+    <w:lsdException w:name="Plain Text" w:semiHidden="1" w:unhideWhenUsed="1"/>
+    <w:lsdException w:name="E-mail Signature" w:semiHidden="1" w:unhideWhenUsed="1"/>
+    <w:lsdException w:name="HTML Top of Form" w:semiHidden="1" w:unhideWhenUsed="1"/>
+    <w:lsdException w:name="HTML Bottom of Form" w:semiHidden="1" w:unhideWhenUsed="1"/>
+    <w:lsdException w:name="Normal (Web)" w:semiHidden="1" w:unhideWhenUsed="1"/>
+    <w:lsdException w:name="HTML Acronym" w:semiHidden="1" w:unhideWhenUsed="1"/>
+    <w:lsdException w:name="HTML Address" w:semiHidden="1" w:unhideWhenUsed="1"/>
+    <w:lsdException w:name="HTML Cite" w:semiHidden="1" w:unhideWhenUsed="1"/>
+    <w:lsdException w:name="HTML Code" w:semiHidden="1" w:unhideWhenUsed="1"/>
+    <w:lsdException w:name="HTML Definition" w:semiHidden="1" w:unhideWhenUsed="1"/>
+    <w:lsdException w:name="HTML Keyboard" w:semiHidden="1" w:unhideWhenUsed="1"/>
+    <w:lsdException w:name="HTML Preformatted" w:semiHidden="1" w:unhideWhenUsed="1"/>
+    <w:lsdException w:name="HTML Sample" w:semiHidden="1" w:unhideWhenUsed="1"/>
+    <w:lsdException w:name="HTML Typewriter" w:semiHidden="1" w:unhideWhenUsed="1"/>
+    <w:lsdException w:name="HTML Variable" w:semiHidden="1" w:unhideWhenUsed="1"/>
+    <w:lsdException w:name="Normal Table" w:semiHidden="1" w:unhideWhenUsed="1"/>
+    <w:lsdException w:name="annotation subject" w:semiHidden="1" w:unhideWhenUsed="1"/>
+    <w:lsdException w:name="No List" w:semiHidden="1" w:unhideWhenUsed="1"/>
+    <w:lsdException w:name="Outline List 1" w:semiHidden="1" w:unhideWhenUsed="1"/>
+    <w:lsdException w:name="Outline List 2" w:semiHidden="1" w:unhideWhenUsed="1"/>
+    <w:lsdException w:name="Outline List 3" w:semiHidden="1" w:unhideWhenUsed="1"/>
+    <w:lsdException w:name="Table Simple 1" w:semiHidden="1" w:unhideWhenUsed="1"/>
+    <w:lsdException w:name="Table Simple 2" w:semiHidden="1" w:unhideWhenUsed="1"/>
+    <w:lsdException w:name="Table Simple 3" w:semiHidden="1" w:unhideWhenUsed="1"/>
+    <w:lsdException w:name="Table Classic 1" w:semiHidden="1" w:unhideWhenUsed="1"/>
+    <w:lsdException w:name="Table Classic 2" w:semiHidden="1" w:unhideWhenUsed="1"/>
+    <w:lsdException w:name="Table Classic 3" w:semiHidden="1" w:unhideWhenUsed="1"/>
+    <w:lsdException w:name="Table Classic 4" w:semiHidden="1" w:unhideWhenUsed="1"/>
+    <w:lsdException w:name="Table Colorful 1" w:semiHidden="1" w:unhideWhenUsed="1"/>
+    <w:lsdException w:name="Table Colorful 2" w:semiHidden="1" w:unhideWhenUsed="1"/>
+    <w:lsdException w:name="Table Colorful 3" w:semiHidden="1" w:unhideWhenUsed="1"/>
+    <w:lsdException w:name="Table Columns 1" w:semiHidden="1" w:unhideWhenUsed="1"/>
+    <w:lsdException w:name="Table Columns 2" w:semiHidden="1" w:unhideWhenUsed="1"/>
+    <w:lsdException w:name="Table Columns 3" w:semiHidden="1" w:unhideWhenUsed="1"/>
+    <w:lsdException w:name="Table Columns 4" w:semiHidden="1" w:unhideWhenUsed="1"/>
+    <w:lsdException w:name="Table Columns 5" w:semiHidden="1" w:unhideWhenUsed="1"/>
+    <w:lsdException w:name="Table Grid 1" w:semiHidden="1" w:unhideWhenUsed="1"/>
+    <w:lsdException w:name="Table Grid 2" w:semiHidden="1" w:unhideWhenUsed="1"/>
+    <w:lsdException w:name="Table Grid 3" w:semiHidden="1" w:unhideWhenUsed="1"/>
+    <w:lsdException w:name="Table Grid 4" w:semiHidden="1" w:unhideWhenUsed="1"/>
+    <w:lsdException w:name="Table Grid 5" w:semiHidden="1" w:unhideWhenUsed="1"/>
+    <w:lsdException w:name="Table Grid 6" w:semiHidden="1" w:unhideWhenUsed="1"/>
+    <w:lsdException w:name="Table Grid 7" w:semiHidden="1" w:unhideWhenUsed="1"/>
+    <w:lsdException w:name="Table Grid 8" w:semiHidden="1" w:unhideWhenUsed="1"/>
+    <w:lsdException w:name="Table List 1" w:semiHidden="1" w:unhideWhenUsed="1"/>
+    <w:lsdException w:name="Table List 2" w:semiHidden="1" w:unhideWhenUsed="1"/>
+    <w:lsdException w:name="Table List 3" w:semiHidden="1" w:unhideWhenUsed="1"/>
+    <w:lsdException w:name="Table List 4" w:semiHidden="1" w:unhideWhenUsed="1"/>
+    <w:lsdException w:name="Table List 5" w:semiHidden="1" w:unhideWhenUsed="1"/>
+    <w:lsdException w:name="Table List 6" w:semiHidden="1" w:unhideWhenUsed="1"/>
+    <w:lsdException w:name="Table List 7" w:semiHidden="1" w:unhideWhenUsed="1"/>
+    <w:lsdException w:name="Table List 8" w:semiHidden="1" w:unhideWhenUsed="1"/>
+    <w:lsdException w:name="Table 3D effects 1" w:semiHidden="1" w:unhideWhenUsed="1"/>
+    <w:lsdException w:name="Table 3D effects 2" w:semiHidden="1" w:unhideWhenUsed="1"/>
+    <w:lsdException w:name="Table 3D effects 3" w:semiHidden="1" w:unhideWhenUsed="1"/>
+    <w:lsdException w:name="Table Contemporary" w:semiHidden="1" w:unhideWhenUsed="1"/>
+    <w:lsdException w:name="Table Elegant" w:semiHidden="1" w:unhideWhenUsed="1"/>
+    <w:lsdException w:name="Table Professional" w:semiHidden="1" w:unhideWhenUsed="1"/>
+    <w:lsdException w:name="Table Subtle 1" w:semiHidden="1" w:unhideWhenUsed="1"/>
+    <w:lsdException w:name="Table Subtle 2" w:semiHidden="1" w:unhideWhenUsed="1"/>
+    <w:lsdException w:name="Table Web 1" w:semiHidden="1" w:unhideWhenUsed="1"/>
+    <w:lsdException w:name="Table Web 2" w:semiHidden="1" w:unhideWhenUsed="1"/>
+    <w:lsdException w:name="Table Web 3" w:semiHidden="1" w:unhideWhenUsed="1"/>
+    <w:lsdException w:name="Balloon Text" w:semiHidden="1" w:unhideWhenUsed="1"/>
+    <w:lsdException w:name="Table Grid" w:uiPriority="39"/>
+    <w:lsdException w:name="Table Theme" w:semiHidden="1" w:unhideWhenUsed="1"/>
+    <w:lsdException w:name="Placeholder Text" w:semiHidden="1"/>
+    <w:lsdException w:name="No Spacing" w:uiPriority="1" w:qFormat="1"/>
+    <w:lsdException w:name="Light Shading" w:uiPriority="60"/>
+    <w:lsdException w:name="Light List" w:uiPriority="61"/>
+    <w:lsdException w:name="Light Grid" w:uiPriority="62"/>
+    <w:lsdException w:name="Medium Shading 1" w:uiPriority="63"/>
+    <w:lsdException w:name="Medium Shading 2" w:uiPriority="64"/>
+    <w:lsdException w:name="Medium List 1" w:uiPriority="65"/>
+    <w:lsdException w:name="Medium List 2" w:uiPriority="66"/>
+    <w:lsdException w:name="Medium Grid 1" w:uiPriority="67"/>
+    <w:lsdException w:name="Medium Grid 2" w:uiPriority="68"/>
+    <w:lsdException w:name="Medium Grid 3" w:uiPriority="69"/>
+    <w:lsdException w:name="Dark List" w:uiPriority="70"/>
+    <w:lsdException w:name="Colorful Shading" w:uiPriority="71"/>
+    <w:lsdException w:name="Colorful List" w:uiPriority="72"/>
+    <w:lsdException w:name="Colorful Grid" w:uiPriority="73"/>
+    <w:lsdException w:name="Light Shading Accent 1" w:uiPriority="60"/>
+    <w:lsdException w:name="Light List Accent 1" w:uiPriority="61"/>
+    <w:lsdException w:name="Light Grid Accent 1" w:uiPriority="62"/>
+    <w:lsdException w:name="Medium Shading 1 Accent 1" w:uiPriority="63"/>
+    <w:lsdException w:name="Medium Shading 2 Accent 1" w:uiPriority="64"/>
+    <w:lsdException w:name="Medium List 1 Accent 1" w:uiPriority="65"/>
+    <w:lsdException w:name="Revision" w:semiHidden="1"/>
+    <w:lsdException w:name="List Paragraph" w:uiPriority="34" w:qFormat="1"/>
+    <w:lsdException w:name="Quote" w:uiPriority="29" w:qFormat="1"/>
+    <w:lsdException w:name="Intense Quote" w:uiPriority="30" w:qFormat="1"/>
+    <w:lsdException w:name="Medium List 2 Accent 1" w:uiPriority="66"/>
+    <w:lsdException w:name="Medium Grid 1 Accent 1" w:uiPriority="67"/>
+    <w:lsdException w:name="Medium Grid 2 Accent 1" w:uiPriority="68"/>
+    <w:lsdException w:name="Medium Grid 3 Accent 1" w:uiPriority="69"/>
+    <w:lsdException w:name="Dark List Accent 1" w:uiPriority="70"/>
+    <w:lsdException w:name="Colorful Shading Accent 1" w:uiPriority="71"/>
+    <w:lsdException w:name="Colorful List Accent 1" w:uiPriority="72"/>
+    <w:lsdException w:name="Colorful Grid Accent 1" w:uiPriority="73"/>
+    <w:lsdException w:name="Light Shading Accent 2" w:uiPriority="60"/>
+    <w:lsdException w:name="Light List Accent 2" w:uiPriority="61"/>
+    <w:lsdException w:name="Light Grid Accent 2" w:uiPriority="62"/>
+    <w:lsdException w:name="Medium Shading 1 Accent 2" w:uiPriority="63"/>
+    <w:lsdException w:name="Medium Shading 2 Accent 2" w:uiPriority="64"/>
+    <w:lsdException w:name="Medium List 1 Accent 2" w:uiPriority="65"/>
+    <w:lsdException w:name="Medium List 2 Accent 2" w:uiPriority="66"/>
+    <w:lsdException w:name="Medium Grid 1 Accent 2" w:uiPriority="67"/>
+    <w:lsdException w:name="Medium Grid 2 Accent 2" w:uiPriority="68"/>
+    <w:lsdException w:name="Medium Grid 3 Accent 2" w:uiPriority="69"/>
+    <w:lsdException w:name="Dark List Accent 2" w:uiPriority="70"/>
+    <w:lsdException w:name="Colorful Shading Accent 2" w:uiPriority="71"/>
+    <w:lsdException w:name="Colorful List Accent 2" w:uiPriority="72"/>
+    <w:lsdException w:name="Colorful Grid Accent 2" w:uiPriority="73"/>
+    <w:lsdException w:name="Light Shading Accent 3" w:uiPriority="60"/>
+    <w:lsdException w:name="Light List Accent 3" w:uiPriority="61"/>
+    <w:lsdException w:name="Light Grid Accent 3" w:uiPriority="62"/>
+    <w:lsdException w:name="Medium Shading 1 Accent 3" w:uiPriority="63"/>
+    <w:lsdException w:name="Medium Shading 2 Accent 3" w:uiPriority="64"/>
+    <w:lsdException w:name="Medium List 1 Accent 3" w:uiPriority="65"/>
+    <w:lsdException w:name="Medium List 2 Accent 3" w:uiPriority="66"/>
+    <w:lsdException w:name="Medium Grid 1 Accent 3" w:uiPriority="67"/>
+    <w:lsdException w:name="Medium Grid 2 Accent 3" w:uiPriority="68"/>
+    <w:lsdException w:name="Medium Grid 3 Accent 3" w:uiPriority="69"/>
+    <w:lsdException w:name="Dark List Accent 3" w:uiPriority="70"/>
+    <w:lsdException w:name="Colorful Shading Accent 3" w:uiPriority="71"/>
+    <w:lsdException w:name="Colorful List Accent 3" w:uiPriority="72"/>
+    <w:lsdException w:name="Colorful Grid Accent 3" w:uiPriority="73"/>
+    <w:lsdException w:name="Light Shading Accent 4" w:uiPriority="60"/>
+    <w:lsdException w:name="Light List Accent 4" w:uiPriority="61"/>
+    <w:lsdException w:name="Light Grid Accent 4" w:uiPriority="62"/>
+    <w:lsdException w:name="Medium Shading 1 Accent 4" w:uiPriority="63"/>
+    <w:lsdException w:name="Medium Shading 2 Accent 4" w:uiPriority="64"/>
+    <w:lsdException w:name="Medium List 1 Accent 4" w:uiPriority="65"/>
+    <w:lsdException w:name="Medium List 2 Accent 4" w:uiPriority="66"/>
+    <w:lsdException w:name="Medium Grid 1 Accent 4" w:uiPriority="67"/>
+    <w:lsdException w:name="Medium Grid 2 Accent 4" w:uiPriority="68"/>
+    <w:lsdException w:name="Medium Grid 3 Accent 4" w:uiPriority="69"/>
+    <w:lsdException w:name="Dark List Accent 4" w:uiPriority="70"/>
+    <w:lsdException w:name="Colorful Shading Accent 4" w:uiPriority="71"/>
+    <w:lsdException w:name="Colorful List Accent 4" w:uiPriority="72"/>
+    <w:lsdException w:name="Colorful Grid Accent 4" w:uiPriority="73"/>
+    <w:lsdException w:name="Light Shading Accent 5" w:uiPriority="60"/>
+    <w:lsdException w:name="Light List Accent 5" w:uiPriority="61"/>
+    <w:lsdException w:name="Light Grid Accent 5" w:uiPriority="62"/>
+    <w:lsdException w:name="Medium Shading 1 Accent 5" w:uiPriority="63"/>
+    <w:lsdException w:name="Medium Shading 2 Accent 5" w:uiPriority="64"/>
+    <w:lsdException w:name="Medium List 1 Accent 5" w:uiPriority="65"/>
+    <w:lsdException w:name="Medium List 2 Accent 5" w:uiPriority="66"/>
+    <w:lsdException w:name="Medium Grid 1 Accent 5" w:uiPriority="67"/>
+    <w:lsdException w:name="Medium Grid 2 Accent 5" w:uiPriority="68"/>
+    <w:lsdException w:name="Medium Grid 3 Accent 5" w:uiPriority="69"/>
+    <w:lsdException w:name="Dark List Accent 5" w:uiPriority="70"/>
+    <w:lsdException w:name="Colorful Shading Accent 5" w:uiPriority="71"/>
+    <w:lsdException w:name="Colorful List Accent 5" w:uiPriority="72"/>
+    <w:lsdException w:name="Colorful Grid Accent 5" w:uiPriority="73"/>
+    <w:lsdException w:name="Light Shading Accent 6" w:uiPriority="60"/>
+    <w:lsdException w:name="Light List Accent 6" w:uiPriority="61"/>
+    <w:lsdException w:name="Light Grid Accent 6" w:uiPriority="62"/>
+    <w:lsdException w:name="Medium Shading 1 Accent 6" w:uiPriority="63"/>
+    <w:lsdException w:name="Medium Shading 2 Accent 6" w:uiPriority="64"/>
+    <w:lsdException w:name="Medium List 1 Accent 6" w:uiPriority="65"/>
+    <w:lsdException w:name="Medium List 2 Accent 6" w:uiPriority="66"/>
+    <w:lsdException w:name="Medium Grid 1 Accent 6" w:uiPriority="67"/>
+    <w:lsdException w:name="Medium Grid 2 Accent 6" w:uiPriority="68"/>
+    <w:lsdException w:name="Medium Grid 3 Accent 6" w:uiPriority="69"/>
+    <w:lsdException w:name="Dark List Accent 6" w:uiPriority="70"/>
+    <w:lsdException w:name="Colorful Shading Accent 6" w:uiPriority="71"/>
+    <w:lsdException w:name="Colorful List Accent 6" w:uiPriority="72"/>
+    <w:lsdException w:name="Colorful Grid Accent 6" w:uiPriority="73"/>
+    <w:lsdException w:name="Subtle Emphasis" w:uiPriority="19" w:qFormat="1"/>
+    <w:lsdException w:name="Intense Emphasis" w:uiPriority="21" w:qFormat="1"/>
+    <w:lsdException w:name="Subtle Reference" w:uiPriority="31" w:qFormat="1"/>
+    <w:lsdException w:name="Intense Reference" w:uiPriority="32" w:qFormat="1"/>
+    <w:lsdException w:name="Book Title" w:uiPriority="33" w:qFormat="1"/>
+    <w:lsdException w:name="Bibliography" w:uiPriority="37" w:semiHidden="1" w:unhideWhenUsed="1"/>
+    <w:lsdException w:name="TOC Heading" w:uiPriority="39" w:semiHidden="1" w:unhideWhenUsed="1" w:qFormat="1"/>
+    <w:lsdException w:name="Plain Table 1" w:uiPriority="41"/>
+    <w:lsdException w:name="Plain Table 2" w:uiPriority="42"/>
+    <w:lsdException w:name="Plain Table 3" w:uiPriority="43"/>
+    <w:lsdException w:name="Plain Table 4" w:uiPriority="44"/>
+    <w:lsdException w:name="Plain Table 5" w:uiPriority="45"/>
+    <w:lsdException w:name="Grid Table Light" w:uiPriority="40"/>
+    <w:lsdException w:name="Grid Table 1 Light" w:uiPriority="46"/>
+    <w:lsdException w:name="Grid Table 2" w:uiPriority="47"/>
+    <w:lsdException w:name="Grid Table 3" w:uiPriority="48"/>
+    <w:lsdException w:name="Grid Table 4" w:uiPriority="49"/>
+    <w:lsdException w:name="Grid Table 5 Dark" w:uiPriority="50"/>
+    <w:lsdException w:name="Grid Table 6 Colorful" w:uiPriority="51"/>
+    <w:lsdException w:name="Grid Table 7 Colorful" w:uiPriority="52"/>
+    <w:lsdException w:name="Grid Table 1 Light Accent 1" w:uiPriority="46"/>
+    <w:lsdException w:name="Grid Table 2 Accent 1" w:uiPriority="47"/>
+    <w:lsdException w:name="Grid Table 3 Accent 1" w:uiPriority="48"/>
+    <w:lsdException w:name="Grid Table 4 Accent 1" w:uiPriority="49"/>
+    <w:lsdException w:name="Grid Table 5 Dark Accent 1" w:uiPriority="50"/>
+    <w:lsdException w:name="Grid Table 6 Colorful Accent 1" w:uiPriority="51"/>
+    <w:lsdException w:name="Grid Table 7 Colorful Accent 1" w:uiPriority="52"/>
+    <w:lsdException w:name="Grid Table 1 Light Accent 2" w:uiPriority="46"/>
+    <w:lsdException w:name="Grid Table 2 Accent 2" w:uiPriority="47"/>
+    <w:lsdException w:name="Grid Table 3 Accent 2" w:uiPriority="48"/>
+    <w:lsdException w:name="Grid Table 4 Accent 2" w:uiPriority="49"/>
+    <w:lsdException w:name="Grid Table 5 Dark Accent 2" w:uiPriority="50"/>
+    <w:lsdException w:name="Grid Table 6 Colorful Accent 2" w:uiPriority="51"/>
+    <w:lsdException w:name="Grid Table 7 Colorful Accent 2" w:uiPriority="52"/>
+    <w:lsdException w:name="Grid Table 1 Light Accent 3" w:uiPriority="46"/>
+    <w:lsdException w:name="Grid Table 2 Accent 3" w:uiPriority="47"/>
+    <w:lsdException w:name="Grid Table 3 Accent 3" w:uiPriority="48"/>
+    <w:lsdException w:name="Grid Table 4 Accent 3" w:uiPriority="49"/>
+    <w:lsdException w:name="Grid Table 5 Dark Accent 3" w:uiPriority="50"/>
+    <w:lsdException w:name="Grid Table 6 Colorful Accent 3" w:uiPriority="51"/>
+    <w:lsdException w:name="Grid Table 7 Colorful Accent 3" w:uiPriority="52"/>
+    <w:lsdException w:name="Grid Table 1 Light Accent 4" w:uiPriority="46"/>
+    <w:lsdException w:name="Grid Table 2 Accent 4" w:uiPriority="47"/>
+    <w:lsdException w:name="Grid Table 3 Accent 4" w:uiPriority="48"/>
+    <w:lsdException w:name="Grid Table 4 Accent 4" w:uiPriority="49"/>
+    <w:lsdException w:name="Grid Table 5 Dark Accent 4" w:uiPriority="50"/>
+    <w:lsdException w:name="Grid Table 6 Colorful Accent 4" w:uiPriority="51"/>
+    <w:lsdException w:name="Grid Table 7 Colorful Accent 4" w:uiPriority="52"/>
+    <w:lsdException w:name="Grid Table 1 Light Accent 5" w:uiPriority="46"/>
+    <w:lsdException w:name="Grid Table 2 Accent 5" w:uiPriority="47"/>
+    <w:lsdException w:name="Grid Table 3 Accent 5" w:uiPriority="48"/>
+    <w:lsdException w:name="Grid Table 4 Accent 5" w:uiPriority="49"/>
+    <w:lsdException w:name="Grid Table 5 Dark Accent 5" w:uiPriority="50"/>
+    <w:lsdException w:name="Grid Table 6 Colorful Accent 5" w:uiPriority="51"/>
+    <w:lsdException w:name="Grid Table 7 Colorful Accent 5" w:uiPriority="52"/>
+    <w:lsdException w:name="Grid Table 1 Light Accent 6" w:uiPriority="46"/>
+    <w:lsdException w:name="Grid Table 2 Accent 6" w:uiPriority="47"/>
+    <w:lsdException w:name="Grid Table 3 Accent 6" w:uiPriority="48"/>
+    <w:lsdException w:name="Grid Table 4 Accent 6" w:uiPriority="49"/>
+    <w:lsdException w:name="Grid Table 5 Dark Accent 6" w:uiPriority="50"/>
+    <w:lsdException w:name="Grid Table 6 Colorful Accent 6" w:uiPriority="51"/>
+    <w:lsdException w:name="Grid Table 7 Colorful Accent 6" w:uiPriority="52"/>
+    <w:lsdException w:name="List Table 1 Light" w:uiPriority="46"/>
+    <w:lsdException w:name="List Table 2" w:uiPriority="47"/>
+    <w:lsdException w:name="List Table 3" w:uiPriority="48"/>
+    <w:lsdException w:name="List Table 4" w:uiPriority="49"/>
+    <w:lsdException w:name="List Table 5 Dark" w:uiPriority="50"/>
+    <w:lsdException w:name="List Table 6 Colorful" w:uiPriority="51"/>
+    <w:lsdException w:name="List Table 7 Colorful" w:uiPriority="52"/>
+    <w:lsdException w:name="List Table 1 Light Accent 1" w:uiPriority="46"/>
+    <w:lsdException w:name="List Table 2 Accent 1" w:uiPriority="47"/>
+    <w:lsdException w:name="List Table 3 Accent 1" w:uiPriority="48"/>
+    <w:lsdException w:name="List Table 4 Accent 1" w:uiPriority="49"/>
+    <w:lsdException w:name="List Table 5 Dark Accent 1" w:uiPriority="50"/>
+    <w:lsdException w:name="List Table 6 Colorful Accent 1" w:uiPriority="51"/>
+    <w:lsdException w:name="List Table 7 Colorful Accent 1" w:uiPriority="52"/>
+    <w:lsdException w:name="List Table 1 Light Accent 2" w:uiPriority="46"/>
+    <w:lsdException w:name="List Table 2 Accent 2" w:uiPriority="47"/>
+    <w:lsdException w:name="List Table 3 Accent 2" w:uiPriority="48"/>
+    <w:lsdException w:name="List Table 4 Accent 2" w:uiPriority="49"/>
+    <w:lsdException w:name="List Table 5 Dark Accent 2" w:uiPriority="50"/>
+    <w:lsdException w:name="List Table 6 Colorful Accent 2" w:uiPriority="51"/>
+    <w:lsdException w:name="List Table 7 Colorful Accent 2" w:uiPriority="52"/>
+    <w:lsdException w:name="List Table 1 Light Accent 3" w:uiPriority="46"/>
+    <w:lsdException w:name="List Table 2 Accent 3" w:uiPriority="47"/>
+    <w:lsdException w:name="List Table 3 Accent 3" w:uiPriority="48"/>
+    <w:lsdException w:name="List Table 4 Accent 3" w:uiPriority="49"/>
+    <w:lsdException w:name="List Table 5 Dark Accent 3" w:uiPriority="50"/>
+    <w:lsdException w:name="List Table 6 Colorful Accent 3" w:uiPriority="51"/>
+    <w:lsdException w:name="List Table 7 Colorful Accent 3" w:uiPriority="52"/>
+    <w:lsdException w:name="List Table 1 Light Accent 4" w:uiPriority="46"/>
+    <w:lsdException w:name="List Table 2 Accent 4" w:uiPriority="47"/>
+    <w:lsdException w:name="List Table 3 Accent 4" w:uiPriority="48"/>
+    <w:lsdException w:name="List Table 4 Accent 4" w:uiPriority="49"/>
+    <w:lsdException w:name="List Table 5 Dark Accent 4" w:uiPriority="50"/>
+    <w:lsdException w:name="List Table 6 Colorful Accent 4" w:uiPriority="51"/>
+    <w:lsdException w:name="List Table 7 Colorful Accent 4" w:uiPriority="52"/>
+    <w:lsdException w:name="List Table 1 Light Accent 5" w:uiPriority="46"/>
+    <w:lsdException w:name="List Table 2 Accent 5" w:uiPriority="47"/>
+    <w:lsdException w:name="List Table 3 Accent 5" w:uiPriority="48"/>
+    <w:lsdException w:name="List Table 4 Accent 5" w:uiPriority="49"/>
+    <w:lsdException w:name="List Table 5 Dark Accent 5" w:uiPriority="50"/>
+    <w:lsdException w:name="List Table 6 Colorful Accent 5" w:uiPriority="51"/>
+    <w:lsdException w:name="List Table 7 Colorful Accent 5" w:uiPriority="52"/>
+    <w:lsdException w:name="List Table 1 Light Accent 6" w:uiPriority="46"/>
+    <w:lsdException w:name="List Table 2 Accent 6" w:uiPriority="47"/>
+    <w:lsdException w:name="List Table 3 Accent 6" w:uiPriority="48"/>
+    <w:lsdException w:name="List Table 4 Accent 6" w:uiPriority="49"/>
+    <w:lsdException w:name="List Table 5 Dark Accent 6" w:uiPriority="50"/>
+    <w:lsdException w:name="List Table 6 Colorful Accent 6" w:uiPriority="51"/>
+    <w:lsdException w:name="List Table 7 Colorful Accent 6" w:uiPriority="52"/>
+    <w:lsdException w:name="Mention" w:semiHidden="1" w:unhideWhenUsed="1"/>
+    <w:lsdException w:name="Smart Hyperlink" w:semiHidden="1" w:unhideWhenUsed="1"/>
+    <w:lsdException w:name="Hashtag" w:semiHidden="1" w:unhideWhenUsed="1"/>
+    <w:lsdException w:name="Unresolved Mention" w:semiHidden="1" w:unhideWhenUsed="1"/>
+    <w:lsdException w:name="Smart Link" w:semiHidden="1" w:unhideWhenUsed="1"/>
+  </w:latentStyles>
+  <w:style w:type="paragraph" w:styleId="Normal" w:default="1">
     <w:name w:val="Normal"/>
     <w:qFormat/>
     <w:pPr>
-      <w:keepNext w:val="false"/>
-      <w:keepLines w:val="false"/>
-      <w:pageBreakBefore w:val="false"/>
       <w:widowControl/>
-      <w:pBdr/>
-      <w:shd w:fill="auto" w:val="clear"/>
       <w:suppressAutoHyphens w:val="true"/>
-      <w:kinsoku w:val="true"/>
-      <w:overflowPunct w:val="true"/>
-      <w:autoSpaceDE w:val="true"/>
       <w:bidi w:val="0"/>
-      <w:snapToGrid w:val="true"/>
-      <w:spacing w:lineRule="auto" w:line="240" w:before="0" w:after="0"/>
+      <w:spacing w:before="0" w:after="0"/>
       <w:jc w:val="start"/>
     </w:pPr>
     <w:rPr>
       <w:rFonts w:ascii="Liberation Serif" w:hAnsi="Liberation Serif" w:eastAsia="Noto Serif CJK SC" w:cs="Noto Sans Devanagari"/>
-      <w:b w:val="false"/>
-      <w:bCs w:val="false"/>
-      <w:i w:val="false"/>
-      <w:iCs w:val="false"/>
-      <w:caps w:val="false"/>
-      <w:smallCaps w:val="false"/>
-      <w:strike w:val="false"/>
-      <w:dstrike w:val="false"/>
-      <w:outline w:val="false"/>
-      <w:emboss w:val="false"/>
-      <w:imprint w:val="false"/>
       <w:color w:val="auto"/>
-      <w:spacing w:val="0"/>
-      <w:w w:val="100"/>
       <w:kern w:val="2"/>
-      <w:position w:val="0"/>
-      <w:sz w:val="24"/>
       <w:sz w:val="24"/>
       <w:szCs w:val="24"/>
-      <w:u w:val="none"/>
-      <w:shd w:fill="auto" w:val="clear"/>
-      <w:vertAlign w:val="baseline"/>
-      <w:em w:val="none"/>
       <w:lang w:val="en-US" w:eastAsia="zh-CN" w:bidi="hi-IN"/>
     </w:rPr>
   </w:style>
@@ -3009,16 +3779,33 @@
     <w:name w:val="Heading 1"/>
     <w:basedOn w:val="Heading"/>
     <w:next w:val="BodyText"/>
+    <w:uiPriority w:val="9"/>
     <w:qFormat/>
     <w:pPr>
       <w:numPr>
         <w:ilvl w:val="0"/>
         <w:numId w:val="1"/>
       </w:numPr>
-      <w:suppressAutoHyphens w:val="true"/>
       <w:outlineLvl w:val="0"/>
     </w:pPr>
     <w:rPr>
+      <w:b/>
+      <w:bCs/>
+      <w:sz w:val="36"/>
+      <w:szCs w:val="36"/>
+    </w:rPr>
+  </w:style>
+  <w:style w:type="paragraph" w:styleId="Heading2">
+    <w:name w:val="Heading 2"/>
+    <w:basedOn w:val="Heading"/>
+    <w:next w:val="BodyText"/>
+    <w:qFormat/>
+    <w:pPr>
+      <w:spacing w:before="200" w:after="120"/>
+      <w:outlineLvl w:val="1"/>
+    </w:pPr>
+    <w:rPr>
+      <w:rFonts w:ascii="Liberation Serif" w:hAnsi="Liberation Serif" w:eastAsia="Noto Serif CJK SC" w:cs="Noto Sans Devanagari"/>
       <w:b/>
       <w:bCs/>
       <w:sz w:val="36"/>
@@ -3029,13 +3816,14 @@
     <w:name w:val="Heading 3"/>
     <w:basedOn w:val="Heading"/>
     <w:next w:val="BodyText"/>
+    <w:uiPriority w:val="9"/>
+    <w:unhideWhenUsed/>
     <w:qFormat/>
     <w:pPr>
       <w:numPr>
         <w:ilvl w:val="2"/>
         <w:numId w:val="1"/>
       </w:numPr>
-      <w:suppressAutoHyphens w:val="true"/>
       <w:spacing w:before="140" w:after="0"/>
       <w:outlineLvl w:val="2"/>
     </w:pPr>
@@ -3045,12 +3833,15 @@
       <w:bCs/>
     </w:rPr>
   </w:style>
-  <w:style w:type="character" w:styleId="DefaultParagraphFont">
+  <w:style w:type="character" w:styleId="DefaultParagraphFont" w:default="1">
     <w:name w:val="Default Paragraph Font"/>
+    <w:uiPriority w:val="1"/>
+    <w:semiHidden/>
+    <w:unhideWhenUsed/>
     <w:qFormat/>
     <w:rPr/>
   </w:style>
-  <w:style w:type="character" w:styleId="NumberingSymbols">
+  <w:style w:type="character" w:styleId="NumberingSymbols" w:customStyle="1">
     <w:name w:val="Numbering Symbols"/>
     <w:qFormat/>
     <w:rPr/>
@@ -3063,84 +3854,87 @@
       <w:bCs/>
     </w:rPr>
   </w:style>
-  <w:style w:type="character" w:styleId="Bullets">
+  <w:style w:type="character" w:styleId="Bullets" w:customStyle="1">
     <w:name w:val="Bullets"/>
     <w:qFormat/>
     <w:rPr>
       <w:rFonts w:ascii="OpenSymbol" w:hAnsi="OpenSymbol" w:eastAsia="OpenSymbol" w:cs="OpenSymbol"/>
     </w:rPr>
   </w:style>
-  <w:style w:type="character" w:styleId="WWCharLFO2LVL1">
+  <w:style w:type="character" w:styleId="WWCharLFO2LVL1" w:customStyle="1">
     <w:name w:val="WW_CharLFO2LVL1"/>
     <w:qFormat/>
     <w:rPr>
       <w:rFonts w:ascii="OpenSymbol" w:hAnsi="OpenSymbol" w:eastAsia="OpenSymbol" w:cs="OpenSymbol"/>
     </w:rPr>
   </w:style>
-  <w:style w:type="character" w:styleId="WWCharLFO2LVL2">
+  <w:style w:type="character" w:styleId="WWCharLFO2LVL2" w:customStyle="1">
     <w:name w:val="WW_CharLFO2LVL2"/>
     <w:qFormat/>
     <w:rPr>
       <w:rFonts w:ascii="OpenSymbol" w:hAnsi="OpenSymbol" w:eastAsia="OpenSymbol" w:cs="OpenSymbol"/>
     </w:rPr>
   </w:style>
-  <w:style w:type="character" w:styleId="WWCharLFO2LVL3">
+  <w:style w:type="character" w:styleId="WWCharLFO2LVL3" w:customStyle="1">
     <w:name w:val="WW_CharLFO2LVL3"/>
     <w:qFormat/>
     <w:rPr>
       <w:rFonts w:ascii="OpenSymbol" w:hAnsi="OpenSymbol" w:eastAsia="OpenSymbol" w:cs="OpenSymbol"/>
     </w:rPr>
   </w:style>
-  <w:style w:type="character" w:styleId="WWCharLFO2LVL4">
+  <w:style w:type="character" w:styleId="WWCharLFO2LVL4" w:customStyle="1">
     <w:name w:val="WW_CharLFO2LVL4"/>
     <w:qFormat/>
     <w:rPr>
       <w:rFonts w:ascii="OpenSymbol" w:hAnsi="OpenSymbol" w:eastAsia="OpenSymbol" w:cs="OpenSymbol"/>
     </w:rPr>
   </w:style>
-  <w:style w:type="character" w:styleId="WWCharLFO2LVL5">
+  <w:style w:type="character" w:styleId="WWCharLFO2LVL5" w:customStyle="1">
     <w:name w:val="WW_CharLFO2LVL5"/>
     <w:qFormat/>
     <w:rPr>
       <w:rFonts w:ascii="OpenSymbol" w:hAnsi="OpenSymbol" w:eastAsia="OpenSymbol" w:cs="OpenSymbol"/>
     </w:rPr>
   </w:style>
-  <w:style w:type="character" w:styleId="WWCharLFO2LVL6">
+  <w:style w:type="character" w:styleId="WWCharLFO2LVL6" w:customStyle="1">
     <w:name w:val="WW_CharLFO2LVL6"/>
     <w:qFormat/>
     <w:rPr>
       <w:rFonts w:ascii="OpenSymbol" w:hAnsi="OpenSymbol" w:eastAsia="OpenSymbol" w:cs="OpenSymbol"/>
     </w:rPr>
   </w:style>
-  <w:style w:type="character" w:styleId="WWCharLFO2LVL7">
+  <w:style w:type="character" w:styleId="WWCharLFO2LVL7" w:customStyle="1">
     <w:name w:val="WW_CharLFO2LVL7"/>
     <w:qFormat/>
     <w:rPr>
       <w:rFonts w:ascii="OpenSymbol" w:hAnsi="OpenSymbol" w:eastAsia="OpenSymbol" w:cs="OpenSymbol"/>
     </w:rPr>
   </w:style>
-  <w:style w:type="character" w:styleId="WWCharLFO2LVL8">
+  <w:style w:type="character" w:styleId="WWCharLFO2LVL8" w:customStyle="1">
     <w:name w:val="WW_CharLFO2LVL8"/>
     <w:qFormat/>
     <w:rPr>
       <w:rFonts w:ascii="OpenSymbol" w:hAnsi="OpenSymbol" w:eastAsia="OpenSymbol" w:cs="OpenSymbol"/>
     </w:rPr>
   </w:style>
-  <w:style w:type="character" w:styleId="WWCharLFO2LVL9">
+  <w:style w:type="character" w:styleId="WWCharLFO2LVL9" w:customStyle="1">
     <w:name w:val="WW_CharLFO2LVL9"/>
     <w:qFormat/>
     <w:rPr>
       <w:rFonts w:ascii="OpenSymbol" w:hAnsi="OpenSymbol" w:eastAsia="OpenSymbol" w:cs="OpenSymbol"/>
     </w:rPr>
   </w:style>
-  <w:style w:type="paragraph" w:styleId="Heading">
+  <w:style w:type="character" w:styleId="LineNumber">
+    <w:name w:val="Line Number"/>
+    <w:rPr/>
+  </w:style>
+  <w:style w:type="paragraph" w:styleId="Heading" w:customStyle="1">
     <w:name w:val="Heading"/>
     <w:basedOn w:val="Normal"/>
     <w:next w:val="BodyText"/>
     <w:qFormat/>
     <w:pPr>
       <w:keepNext w:val="true"/>
-      <w:suppressAutoHyphens w:val="true"/>
       <w:spacing w:before="240" w:after="120"/>
     </w:pPr>
     <w:rPr>
@@ -3153,64 +3947,14 @@
     <w:name w:val="Body Text"/>
     <w:basedOn w:val="Normal"/>
     <w:pPr>
-      <w:suppressAutoHyphens w:val="true"/>
       <w:spacing w:lineRule="auto" w:line="276" w:before="0" w:after="140"/>
     </w:pPr>
     <w:rPr/>
   </w:style>
-  <w:style w:type="paragraph" w:styleId="Normal1">
-    <w:name w:val="Normal1"/>
-    <w:qFormat/>
-    <w:pPr>
-      <w:keepNext w:val="false"/>
-      <w:keepLines w:val="false"/>
-      <w:pageBreakBefore w:val="false"/>
-      <w:widowControl/>
-      <w:pBdr/>
-      <w:shd w:fill="auto" w:val="clear"/>
-      <w:suppressAutoHyphens w:val="true"/>
-      <w:kinsoku w:val="true"/>
-      <w:overflowPunct w:val="true"/>
-      <w:autoSpaceDE w:val="true"/>
-      <w:bidi w:val="0"/>
-      <w:snapToGrid w:val="true"/>
-      <w:spacing w:lineRule="auto" w:line="240" w:before="0" w:after="0"/>
-      <w:jc w:val="start"/>
-    </w:pPr>
-    <w:rPr>
-      <w:rFonts w:ascii="Liberation Serif" w:hAnsi="Liberation Serif" w:eastAsia="Noto Serif CJK SC" w:cs="Noto Sans Devanagari"/>
-      <w:b w:val="false"/>
-      <w:bCs w:val="false"/>
-      <w:i w:val="false"/>
-      <w:iCs w:val="false"/>
-      <w:caps w:val="false"/>
-      <w:smallCaps w:val="false"/>
-      <w:strike w:val="false"/>
-      <w:dstrike w:val="false"/>
-      <w:outline w:val="false"/>
-      <w:emboss w:val="false"/>
-      <w:imprint w:val="false"/>
-      <w:color w:val="auto"/>
-      <w:spacing w:val="0"/>
-      <w:w w:val="100"/>
-      <w:kern w:val="2"/>
-      <w:position w:val="0"/>
-      <w:sz w:val="24"/>
-      <w:sz w:val="24"/>
-      <w:szCs w:val="24"/>
-      <w:u w:val="none"/>
-      <w:shd w:fill="auto" w:val="clear"/>
-      <w:vertAlign w:val="baseline"/>
-      <w:em w:val="none"/>
-      <w:lang w:val="en-US" w:eastAsia="zh-CN" w:bidi="hi-IN"/>
-    </w:rPr>
-  </w:style>
   <w:style w:type="paragraph" w:styleId="List">
     <w:name w:val="List"/>
     <w:basedOn w:val="BodyText"/>
-    <w:pPr>
-      <w:suppressAutoHyphens w:val="true"/>
-    </w:pPr>
+    <w:pPr/>
     <w:rPr/>
   </w:style>
   <w:style w:type="paragraph" w:styleId="Caption">
@@ -3219,7 +3963,6 @@
     <w:qFormat/>
     <w:pPr>
       <w:suppressLineNumbers/>
-      <w:suppressAutoHyphens w:val="true"/>
       <w:spacing w:before="120" w:after="120"/>
     </w:pPr>
     <w:rPr>
@@ -3227,15 +3970,76 @@
       <w:iCs/>
     </w:rPr>
   </w:style>
-  <w:style w:type="paragraph" w:styleId="Index">
+  <w:style w:type="paragraph" w:styleId="Index" w:customStyle="1">
     <w:name w:val="Index"/>
     <w:basedOn w:val="Normal"/>
     <w:qFormat/>
     <w:pPr>
       <w:suppressLineNumbers/>
-      <w:suppressAutoHyphens w:val="true"/>
     </w:pPr>
     <w:rPr/>
+  </w:style>
+  <w:style w:type="paragraph" w:styleId="Normal1" w:customStyle="1">
+    <w:name w:val="Normal1"/>
+    <w:qFormat/>
+    <w:pPr>
+      <w:widowControl/>
+      <w:suppressAutoHyphens w:val="true"/>
+      <w:bidi w:val="0"/>
+      <w:spacing w:before="0" w:after="0"/>
+      <w:jc w:val="start"/>
+    </w:pPr>
+    <w:rPr>
+      <w:rFonts w:ascii="Liberation Serif" w:hAnsi="Liberation Serif" w:eastAsia="Noto Serif CJK SC" w:cs="Noto Sans Devanagari"/>
+      <w:color w:val="auto"/>
+      <w:kern w:val="2"/>
+      <w:sz w:val="24"/>
+      <w:szCs w:val="24"/>
+      <w:lang w:val="en-US" w:eastAsia="zh-CN" w:bidi="hi-IN"/>
+    </w:rPr>
+  </w:style>
+  <w:style w:type="paragraph" w:styleId="Revision">
+    <w:name w:val="Revision"/>
+    <w:uiPriority w:val="99"/>
+    <w:semiHidden/>
+    <w:qFormat/>
+    <w:rsid w:val="00a246a3"/>
+    <w:pPr>
+      <w:widowControl/>
+      <w:suppressAutoHyphens w:val="true"/>
+      <w:bidi w:val="0"/>
+      <w:spacing w:before="0" w:after="0"/>
+      <w:jc w:val="start"/>
+    </w:pPr>
+    <w:rPr>
+      <w:rFonts w:ascii="Liberation Serif" w:hAnsi="Liberation Serif" w:eastAsia="Noto Serif CJK SC" w:cs="Mangal"/>
+      <w:color w:val="auto"/>
+      <w:kern w:val="2"/>
+      <w:sz w:val="24"/>
+      <w:szCs w:val="21"/>
+      <w:lang w:val="en-US" w:eastAsia="zh-CN" w:bidi="hi-IN"/>
+    </w:rPr>
+  </w:style>
+  <w:style w:type="numbering" w:styleId="NoList" w:default="1">
+    <w:name w:val="No List"/>
+    <w:uiPriority w:val="99"/>
+    <w:semiHidden/>
+    <w:unhideWhenUsed/>
+    <w:qFormat/>
+  </w:style>
+  <w:style w:type="table" w:default="1" w:styleId="TableNormal">
+    <w:name w:val="Normal Table"/>
+    <w:uiPriority w:val="99"/>
+    <w:semiHidden/>
+    <w:unhideWhenUsed/>
+    <w:tblPr>
+      <w:tblCellMar>
+        <w:top w:w="0" w:type="dxa"/>
+        <w:left w:w="108" w:type="dxa"/>
+        <w:bottom w:w="0" w:type="dxa"/>
+        <w:right w:w="108" w:type="dxa"/>
+      </w:tblCellMar>
+    </w:tblPr>
   </w:style>
 </w:styles>
 </file>

</xml_diff>

<commit_message>
instructions writing and download link
</commit_message>
<xml_diff>
--- a/pipeline/Instructions.docx
+++ b/pipeline/Instructions.docx
@@ -827,14 +827,7 @@
           <w:sz w:val="24"/>
           <w:szCs w:val="24"/>
         </w:rPr>
-        <w:t xml:space="preserve">Extract the zip file </w:t>
-      </w:r>
-      <w:r>
-        <w:rPr>
-          <w:sz w:val="24"/>
-          <w:szCs w:val="24"/>
-        </w:rPr>
-        <w:t>using the following steps:</w:t>
+        <w:t>Extract the zip file using the following steps:</w:t>
       </w:r>
     </w:p>
     <w:p>
@@ -853,11 +846,7 @@
       </w:pPr>
       <w:r>
         <w:rPr/>
-        <w:t xml:space="preserve">Locate the </w:t>
-      </w:r>
-      <w:r>
-        <w:rPr/>
-        <w:t>folder</w:t>
+        <w:t>Locate the folder</w:t>
       </w:r>
       <w:del w:id="0" w:author="Unknown Author" w:date="2026-03-06T14:40:17Z">
         <w:r>
@@ -867,15 +856,7 @@
       </w:del>
       <w:r>
         <w:rPr/>
-        <w:t xml:space="preserve"> </w:t>
-      </w:r>
-      <w:r>
-        <w:rPr/>
-        <w:t>containing the extraction tool,</w:t>
-      </w:r>
-      <w:r>
-        <w:rPr/>
-        <w:t xml:space="preserve"> to unzip (extract) files or folders from.</w:t>
+        <w:t xml:space="preserve"> containing the extraction tool, to unzip (extract) files or folders from.</w:t>
       </w:r>
     </w:p>
     <w:p>
@@ -916,7 +897,10 @@
         </w:rPr>
       </w:pPr>
       <w:r>
-        <w:rPr/>
+        <w:rPr>
+          <w:sz w:val="28"/>
+          <w:szCs w:val="32"/>
+        </w:rPr>
       </w:r>
       <w:r>
         <w:br w:type="page"/>
@@ -925,6 +909,7 @@
     <w:p>
       <w:pPr>
         <w:pStyle w:val="Normal"/>
+        <w:spacing w:before="0" w:after="0"/>
         <w:rPr/>
       </w:pPr>
       <w:r>
@@ -1082,7 +1067,12 @@
         </w:rPr>
       </w:pPr>
       <w:r>
-        <w:rPr/>
+        <w:rPr>
+          <w:b/>
+          <w:bCs/>
+          <w:sz w:val="28"/>
+          <w:szCs w:val="32"/>
+        </w:rPr>
       </w:r>
     </w:p>
     <w:p>
@@ -1484,12 +1474,11 @@
       </w:r>
       <w:r>
         <w:rPr>
-          <w:rFonts w:ascii="Liberation Serif" w:hAnsi="Liberation Serif" w:eastAsia="Noto Serif CJK SC" w:cs="Noto Sans Devanagari"/>
+          <w:rFonts w:eastAsia="Noto Serif CJK SC" w:cs="Noto Sans Devanagari"/>
           <w:b w:val="false"/>
           <w:bCs w:val="false"/>
           <w:i w:val="false"/>
           <w:iCs w:val="false"/>
-          <w:color w:val="auto"/>
           <w:color w:val="EE0000"/>
           <w:lang w:val="en-US" w:eastAsia="zh-CN" w:bidi="hi-IN"/>
           <w:rPrChange w:id="0" w:author="Unknown Author" w:date="2026-03-06T14:23:03Z">
@@ -1514,27 +1503,7 @@
           <w:iCs w:val="false"/>
           <w:color w:val="auto"/>
         </w:rPr>
-        <w:t>You may fil</w:t>
-      </w:r>
-      <w:r>
-        <w:rPr>
-          <w:b w:val="false"/>
-          <w:bCs w:val="false"/>
-          <w:i w:val="false"/>
-          <w:iCs w:val="false"/>
-          <w:color w:val="auto"/>
-        </w:rPr>
-        <w:t xml:space="preserve">l in any additional information manually (e.g. imaging platform). </w:t>
-      </w:r>
-      <w:r>
-        <w:rPr>
-          <w:b w:val="false"/>
-          <w:bCs w:val="false"/>
-          <w:i w:val="false"/>
-          <w:iCs w:val="false"/>
-          <w:color w:val="auto"/>
-        </w:rPr>
-        <w:t>You can also manually fill in the project and photographer IDs if you wish to have a different IDs for different rows. The IDs can be found in the Project Management Pages of the system via “View” button which will show the details of the project.</w:t>
+        <w:t>You may fill in any additional information manually (e.g. imaging platform). You can also manually fill in the project and photographer IDs if you wish to have a different IDs for different rows. The IDs can be found in the Project Management Pages of the system via “View” button which will show the details of the project.</w:t>
       </w:r>
     </w:p>
     <w:p>
@@ -1584,25 +1553,7 @@
           <w:i/>
           <w:iCs/>
         </w:rPr>
-        <w:t xml:space="preserve">If you faced errors, you can compare the error log </w:t>
-      </w:r>
-      <w:r>
-        <w:rPr>
-          <w:b/>
-          <w:bCs/>
-          <w:i/>
-          <w:iCs/>
-        </w:rPr>
-        <w:t>(In the same unzipped folder as the extraction tool)</w:t>
-      </w:r>
-      <w:r>
-        <w:rPr>
-          <w:b/>
-          <w:bCs/>
-          <w:i/>
-          <w:iCs/>
-        </w:rPr>
-        <w:t xml:space="preserve"> and the csv file side by side like this where the row indices correspond to the indices of the other file:</w:t>
+        <w:t>If you faced errors, you can compare the error log (In the same unzipped folder as the extraction tool) and the csv file side by side like this where the row indices correspond to the indices of the other file:</w:t>
       </w:r>
     </w:p>
     <w:p>
@@ -1796,7 +1747,15 @@
       </w:pPr>
       <w:r>
         <w:rPr/>
-        <w:t>All images are registered as being generated or belonging to a project. You will need to create a project first to upload any image metadata.</w:t>
+        <w:t xml:space="preserve">All images </w:t>
+      </w:r>
+      <w:r>
+        <w:rPr/>
+        <w:t xml:space="preserve">must be registered in </w:t>
+      </w:r>
+      <w:r>
+        <w:rPr/>
+        <w:t>a project. You will need to create a project first to upload any image metadata.</w:t>
       </w:r>
     </w:p>
     <w:p>
@@ -2407,7 +2366,7 @@
       </w:r>
       <w:r>
         <w:rPr/>
-        <w:t xml:space="preserve">You will now see this page , </w:t>
+        <w:t xml:space="preserve">You will now see this page </w:t>
       </w:r>
     </w:p>
     <w:p>
@@ -3097,6 +3056,7 @@
         </w:tabs>
         <w:ind w:start="720" w:hanging="360"/>
       </w:pPr>
+      <w:rPr/>
     </w:lvl>
     <w:lvl w:ilvl="1">
       <w:start w:val="1"/>
@@ -3235,7 +3195,6 @@
     </w:lvl>
     <w:lvl w:ilvl="1">
       <w:start w:val="1"/>
-      <w:pStyle w:val="Heading2"/>
       <w:numFmt w:val="none"/>
       <w:suff w:val="nothing"/>
       <w:lvlText w:val=""/>

</xml_diff>

<commit_message>
instructions update for file name format
</commit_message>
<xml_diff>
--- a/pipeline/Instructions.docx
+++ b/pipeline/Instructions.docx
@@ -2458,7 +2458,25 @@
           <w:sz w:val="30"/>
           <w:szCs w:val="30"/>
         </w:rPr>
-        <w:t>TaxonName_CatalogNumber_photoID_additionalinfoifany.fileformat</w:t>
+        <w:t>TaxonName_CatalogNumber_</w:t>
+      </w:r>
+      <w:r>
+        <w:rPr>
+          <w:b/>
+          <w:bCs/>
+          <w:sz w:val="30"/>
+          <w:szCs w:val="30"/>
+        </w:rPr>
+        <w:t>description</w:t>
+      </w:r>
+      <w:r>
+        <w:rPr>
+          <w:b/>
+          <w:bCs/>
+          <w:sz w:val="30"/>
+          <w:szCs w:val="30"/>
+        </w:rPr>
+        <w:t>.fileformat</w:t>
       </w:r>
     </w:p>
     <w:p>
@@ -2468,6 +2486,16 @@
       </w:pPr>
       <w:r>
         <w:rPr/>
+        <w:t>There must be only two underscores as deliminator for the information or else the extraction tool will throw an error.</w:t>
+      </w:r>
+    </w:p>
+    <w:p>
+      <w:pPr>
+        <w:pStyle w:val="BodyText"/>
+        <w:rPr/>
+      </w:pPr>
+      <w:r>
+        <w:rPr/>
         <w:t>If any of the information is missing, put ‘none’ instead.</w:t>
       </w:r>
     </w:p>
@@ -2478,7 +2506,15 @@
       </w:pPr>
       <w:r>
         <w:rPr/>
-        <w:t>CatalogID will be need to have this convention: ZRCBDP0012345. 6 capital letters and then 7 numbers if not an error will be raised</w:t>
+        <w:t xml:space="preserve">CatalogID will be need to have this convention: ZRCBDP0012345. </w:t>
+      </w:r>
+      <w:r>
+        <w:rPr/>
+        <w:t xml:space="preserve">The id must start with ‘ZRCBDP‘ or ‘ZRCENT’ </w:t>
+      </w:r>
+      <w:r>
+        <w:rPr/>
+        <w:t>and then 7 numbers if not an error will be raised</w:t>
       </w:r>
     </w:p>
     <w:p>
@@ -2500,6 +2536,26 @@
       <w:r>
         <w:rPr/>
         <w:t>Any images names with ‘thumb’ or ‘index’ will be ignored.</w:t>
+      </w:r>
+    </w:p>
+    <w:p>
+      <w:pPr>
+        <w:pStyle w:val="BodyText"/>
+        <w:spacing w:lineRule="auto" w:line="276" w:before="0" w:after="140"/>
+        <w:rPr/>
+      </w:pPr>
+      <w:r>
+        <w:rPr/>
+      </w:r>
+    </w:p>
+    <w:p>
+      <w:pPr>
+        <w:pStyle w:val="BodyText"/>
+        <w:spacing w:lineRule="auto" w:line="276" w:before="0" w:after="140"/>
+        <w:rPr/>
+      </w:pPr>
+      <w:r>
+        <w:rPr/>
       </w:r>
     </w:p>
     <w:sectPr>

</xml_diff>